<commit_message>
Renumber supplementary tables so citations run S1, S2, S3
</commit_message>
<xml_diff>
--- a/peerj_analysis/tables/Supplemental Table S1.docx
+++ b/peerj_analysis/tables/Supplemental Table S1.docx
@@ -8,7 +8,7 @@
           <w:b/>
           <w:sz w:val="22"/>
         </w:rPr>
-        <w:t>Table S1. Frozen endpoint definitions.</w:t>
+        <w:t>Table S1. Discrimination of the frozen scoring rule.</w:t>
       </w:r>
     </w:p>
     <w:tbl>
@@ -19,14 +19,18 @@
         <w:tblLook w:firstColumn="1" w:firstRow="1" w:lastColumn="0" w:lastRow="0" w:noHBand="0" w:noVBand="1" w:val="04A0"/>
       </w:tblPr>
       <w:tblGrid>
-        <w:gridCol w:w="3120"/>
-        <w:gridCol w:w="3120"/>
-        <w:gridCol w:w="3120"/>
+        <w:gridCol w:w="1337"/>
+        <w:gridCol w:w="1337"/>
+        <w:gridCol w:w="1337"/>
+        <w:gridCol w:w="1337"/>
+        <w:gridCol w:w="1337"/>
+        <w:gridCol w:w="1337"/>
+        <w:gridCol w:w="1337"/>
       </w:tblGrid>
       <w:tr>
         <w:tc>
           <w:tcPr>
-            <w:tcW w:type="dxa" w:w="1872"/>
+            <w:tcW w:type="dxa" w:w="2160"/>
           </w:tcPr>
           <w:p>
             <w:r/>
@@ -36,13 +40,13 @@
                 <w:b/>
                 <w:sz w:val="16"/>
               </w:rPr>
-              <w:t>Criterion</w:t>
+              <w:t>Scope</w:t>
             </w:r>
           </w:p>
         </w:tc>
         <w:tc>
           <w:tcPr>
-            <w:tcW w:type="dxa" w:w="3456"/>
+            <w:tcW w:type="dxa" w:w="1296"/>
           </w:tcPr>
           <w:p>
             <w:r/>
@@ -52,13 +56,13 @@
                 <w:b/>
                 <w:sz w:val="16"/>
               </w:rPr>
-              <w:t>Rule</w:t>
+              <w:t>Seed</w:t>
             </w:r>
           </w:p>
         </w:tc>
         <w:tc>
           <w:tcPr>
-            <w:tcW w:type="dxa" w:w="4320"/>
+            <w:tcW w:type="dxa" w:w="1584"/>
           </w:tcPr>
           <w:p>
             <w:r/>
@@ -68,7 +72,71 @@
                 <w:b/>
                 <w:sz w:val="16"/>
               </w:rPr>
-              <w:t>Meaning</w:t>
+              <w:t>Model family</w:t>
+            </w:r>
+          </w:p>
+        </w:tc>
+        <w:tc>
+          <w:tcPr>
+            <w:tcW w:type="dxa" w:w="576"/>
+          </w:tcPr>
+          <w:p>
+            <w:r/>
+            <w:r>
+              <w:rPr>
+                <w:rFonts w:ascii="Times New Roman" w:hAnsi="Times New Roman"/>
+                <w:b/>
+                <w:sz w:val="16"/>
+              </w:rPr>
+              <w:t>n</w:t>
+            </w:r>
+          </w:p>
+        </w:tc>
+        <w:tc>
+          <w:tcPr>
+            <w:tcW w:type="dxa" w:w="864"/>
+          </w:tcPr>
+          <w:p>
+            <w:r/>
+            <w:r>
+              <w:rPr>
+                <w:rFonts w:ascii="Times New Roman" w:hAnsi="Times New Roman"/>
+                <w:b/>
+                <w:sz w:val="16"/>
+              </w:rPr>
+              <w:t>AUC</w:t>
+            </w:r>
+          </w:p>
+        </w:tc>
+        <w:tc>
+          <w:tcPr>
+            <w:tcW w:type="dxa" w:w="1296"/>
+          </w:tcPr>
+          <w:p>
+            <w:r/>
+            <w:r>
+              <w:rPr>
+                <w:rFonts w:ascii="Times New Roman" w:hAnsi="Times New Roman"/>
+                <w:b/>
+                <w:sz w:val="16"/>
+              </w:rPr>
+              <w:t>Observed success</w:t>
+            </w:r>
+          </w:p>
+        </w:tc>
+        <w:tc>
+          <w:tcPr>
+            <w:tcW w:type="dxa" w:w="1296"/>
+          </w:tcPr>
+          <w:p>
+            <w:r/>
+            <w:r>
+              <w:rPr>
+                <w:rFonts w:ascii="Times New Roman" w:hAnsi="Times New Roman"/>
+                <w:b/>
+                <w:sz w:val="16"/>
+              </w:rPr>
+              <w:t>Mean predicted</w:t>
             </w:r>
           </w:p>
         </w:tc>
@@ -76,7 +144,7 @@
       <w:tr>
         <w:tc>
           <w:tcPr>
-            <w:tcW w:type="dxa" w:w="1872"/>
+            <w:tcW w:type="dxa" w:w="2160"/>
           </w:tcPr>
           <w:p>
             <w:r/>
@@ -85,13 +153,13 @@
                 <w:rFonts w:ascii="Times New Roman" w:hAnsi="Times New Roman"/>
                 <w:sz w:val="16"/>
               </w:rPr>
-              <w:t>warm</w:t>
+              <w:t>locked validation (seeds 20260720-22)</w:t>
             </w:r>
           </w:p>
         </w:tc>
         <w:tc>
           <w:tcPr>
-            <w:tcW w:type="dxa" w:w="3456"/>
+            <w:tcW w:type="dxa" w:w="1296"/>
           </w:tcPr>
           <w:p>
             <w:r/>
@@ -100,13 +168,13 @@
                 <w:rFonts w:ascii="Times New Roman" w:hAnsi="Times New Roman"/>
                 <w:sz w:val="16"/>
               </w:rPr>
-              <w:t>warm_fraction ≥ 0.50</w:t>
+              <w:t>seed_20260720</w:t>
             </w:r>
           </w:p>
         </w:tc>
         <w:tc>
           <w:tcPr>
-            <w:tcW w:type="dxa" w:w="4320"/>
+            <w:tcW w:type="dxa" w:w="1584"/>
           </w:tcPr>
           <w:p>
             <w:r/>
@@ -115,15 +183,13 @@
                 <w:rFonts w:ascii="Times New Roman" w:hAnsi="Times New Roman"/>
                 <w:sz w:val="16"/>
               </w:rPr>
-              <w:t>fraction of the protocol window with 43 ≤ T ≤ 50 °C</w:t>
+              <w:t>baseline</w:t>
             </w:r>
           </w:p>
         </w:tc>
-      </w:tr>
-      <w:tr>
         <w:tc>
           <w:tcPr>
-            <w:tcW w:type="dxa" w:w="1872"/>
+            <w:tcW w:type="dxa" w:w="576"/>
           </w:tcPr>
           <w:p>
             <w:r/>
@@ -132,13 +198,13 @@
                 <w:rFonts w:ascii="Times New Roman" w:hAnsi="Times New Roman"/>
                 <w:sz w:val="16"/>
               </w:rPr>
-              <w:t>ros</w:t>
+              <w:t>384</w:t>
             </w:r>
           </w:p>
         </w:tc>
         <w:tc>
           <w:tcPr>
-            <w:tcW w:type="dxa" w:w="3456"/>
+            <w:tcW w:type="dxa" w:w="864"/>
           </w:tcPr>
           <w:p>
             <w:r/>
@@ -147,13 +213,13 @@
                 <w:rFonts w:ascii="Times New Roman" w:hAnsi="Times New Roman"/>
                 <w:sz w:val="16"/>
               </w:rPr>
-              <w:t>ros_threshold_fraction ≥ 0.50</w:t>
+              <w:t>0.727</w:t>
             </w:r>
           </w:p>
         </w:tc>
         <w:tc>
           <w:tcPr>
-            <w:tcW w:type="dxa" w:w="4320"/>
+            <w:tcW w:type="dxa" w:w="1296"/>
           </w:tcPr>
           <w:p>
             <w:r/>
@@ -162,15 +228,13 @@
                 <w:rFonts w:ascii="Times New Roman" w:hAnsi="Times New Roman"/>
                 <w:sz w:val="16"/>
               </w:rPr>
-              <w:t>fraction of the window with ROS dose at or above the singlet-oxygen threshold</w:t>
+              <w:t>0.576</w:t>
             </w:r>
           </w:p>
         </w:tc>
-      </w:tr>
-      <w:tr>
         <w:tc>
           <w:tcPr>
-            <w:tcW w:type="dxa" w:w="1872"/>
+            <w:tcW w:type="dxa" w:w="1296"/>
           </w:tcPr>
           <w:p>
             <w:r/>
@@ -179,13 +243,15 @@
                 <w:rFonts w:ascii="Times New Roman" w:hAnsi="Times New Roman"/>
                 <w:sz w:val="16"/>
               </w:rPr>
-              <w:t>hypoxia_ok</w:t>
+              <w:t>0.558</w:t>
             </w:r>
           </w:p>
         </w:tc>
+      </w:tr>
+      <w:tr>
         <w:tc>
           <w:tcPr>
-            <w:tcW w:type="dxa" w:w="3456"/>
+            <w:tcW w:type="dxa" w:w="2160"/>
           </w:tcPr>
           <w:p>
             <w:r/>
@@ -194,13 +260,13 @@
                 <w:rFonts w:ascii="Times New Roman" w:hAnsi="Times New Roman"/>
                 <w:sz w:val="16"/>
               </w:rPr>
-              <w:t>hypoxic_failure_fraction ≤ 0.35</w:t>
+              <w:t>locked validation (seeds 20260720-22)</w:t>
             </w:r>
           </w:p>
         </w:tc>
         <w:tc>
           <w:tcPr>
-            <w:tcW w:type="dxa" w:w="4320"/>
+            <w:tcW w:type="dxa" w:w="1296"/>
           </w:tcPr>
           <w:p>
             <w:r/>
@@ -209,15 +275,13 @@
                 <w:rFonts w:ascii="Times New Roman" w:hAnsi="Times New Roman"/>
                 <w:sz w:val="16"/>
               </w:rPr>
-              <w:t>fraction of the window with O2 &lt; 5 µM AND ROS below threshold</w:t>
+              <w:t>seed_20260720</w:t>
             </w:r>
           </w:p>
         </w:tc>
-      </w:tr>
-      <w:tr>
         <w:tc>
           <w:tcPr>
-            <w:tcW w:type="dxa" w:w="1872"/>
+            <w:tcW w:type="dxa" w:w="1584"/>
           </w:tcPr>
           <w:p>
             <w:r/>
@@ -226,13 +290,13 @@
                 <w:rFonts w:ascii="Times New Roman" w:hAnsi="Times New Roman"/>
                 <w:sz w:val="16"/>
               </w:rPr>
-              <w:t>safe_heat</w:t>
+              <w:t>large_geometry</w:t>
             </w:r>
           </w:p>
         </w:tc>
         <w:tc>
           <w:tcPr>
-            <w:tcW w:type="dxa" w:w="3456"/>
+            <w:tcW w:type="dxa" w:w="576"/>
           </w:tcPr>
           <w:p>
             <w:r/>
@@ -241,13 +305,13 @@
                 <w:rFonts w:ascii="Times New Roman" w:hAnsi="Times New Roman"/>
                 <w:sz w:val="16"/>
               </w:rPr>
-              <w:t>overheat_fraction ≤ 0.05 and max_T ≤ 55 °C</w:t>
+              <w:t>384</w:t>
             </w:r>
           </w:p>
         </w:tc>
         <w:tc>
           <w:tcPr>
-            <w:tcW w:type="dxa" w:w="4320"/>
+            <w:tcW w:type="dxa" w:w="864"/>
           </w:tcPr>
           <w:p>
             <w:r/>
@@ -256,15 +320,13 @@
                 <w:rFonts w:ascii="Times New Roman" w:hAnsi="Times New Roman"/>
                 <w:sz w:val="16"/>
               </w:rPr>
-              <w:t>no thermal injury</w:t>
+              <w:t>0.717</w:t>
             </w:r>
           </w:p>
         </w:tc>
-      </w:tr>
-      <w:tr>
         <w:tc>
           <w:tcPr>
-            <w:tcW w:type="dxa" w:w="1872"/>
+            <w:tcW w:type="dxa" w:w="1296"/>
           </w:tcPr>
           <w:p>
             <w:r/>
@@ -273,13 +335,13 @@
                 <w:rFonts w:ascii="Times New Roman" w:hAnsi="Times New Roman"/>
                 <w:sz w:val="16"/>
               </w:rPr>
-              <w:t>success</w:t>
+              <w:t>0.604</w:t>
             </w:r>
           </w:p>
         </w:tc>
         <w:tc>
           <w:tcPr>
-            <w:tcW w:type="dxa" w:w="3456"/>
+            <w:tcW w:type="dxa" w:w="1296"/>
           </w:tcPr>
           <w:p>
             <w:r/>
@@ -288,13 +350,15 @@
                 <w:rFonts w:ascii="Times New Roman" w:hAnsi="Times New Roman"/>
                 <w:sz w:val="16"/>
               </w:rPr>
-              <w:t>warm AND ros AND hypoxia_ok AND safe_heat</w:t>
+              <w:t>0.602</w:t>
             </w:r>
           </w:p>
         </w:tc>
+      </w:tr>
+      <w:tr>
         <w:tc>
           <w:tcPr>
-            <w:tcW w:type="dxa" w:w="4320"/>
+            <w:tcW w:type="dxa" w:w="2160"/>
           </w:tcPr>
           <w:p>
             <w:r/>
@@ -303,15 +367,13 @@
                 <w:rFonts w:ascii="Times New Roman" w:hAnsi="Times New Roman"/>
                 <w:sz w:val="16"/>
               </w:rPr>
-              <w:t>all four criteria simultaneously</w:t>
+              <w:t>locked validation (seeds 20260720-22)</w:t>
             </w:r>
           </w:p>
         </w:tc>
-      </w:tr>
-      <w:tr>
         <w:tc>
           <w:tcPr>
-            <w:tcW w:type="dxa" w:w="1872"/>
+            <w:tcW w:type="dxa" w:w="1296"/>
           </w:tcPr>
           <w:p>
             <w:r/>
@@ -320,13 +382,13 @@
                 <w:rFonts w:ascii="Times New Roman" w:hAnsi="Times New Roman"/>
                 <w:sz w:val="16"/>
               </w:rPr>
-              <w:t>thermal_failure</w:t>
+              <w:t>seed_20260720</w:t>
             </w:r>
           </w:p>
         </w:tc>
         <w:tc>
           <w:tcPr>
-            <w:tcW w:type="dxa" w:w="3456"/>
+            <w:tcW w:type="dxa" w:w="1584"/>
           </w:tcPr>
           <w:p>
             <w:r/>
@@ -335,13 +397,13 @@
                 <w:rFonts w:ascii="Times New Roman" w:hAnsi="Times New Roman"/>
                 <w:sz w:val="16"/>
               </w:rPr>
-              <w:t>NOT warm AND safe_heat</w:t>
+              <w:t>low_photosensitizer</w:t>
             </w:r>
           </w:p>
         </w:tc>
         <w:tc>
           <w:tcPr>
-            <w:tcW w:type="dxa" w:w="4320"/>
+            <w:tcW w:type="dxa" w:w="576"/>
           </w:tcPr>
           <w:p>
             <w:r/>
@@ -350,15 +412,13 @@
                 <w:rFonts w:ascii="Times New Roman" w:hAnsi="Times New Roman"/>
                 <w:sz w:val="16"/>
               </w:rPr>
-              <w:t>insufficient heating without thermal injury</w:t>
+              <w:t>384</w:t>
             </w:r>
           </w:p>
         </w:tc>
-      </w:tr>
-      <w:tr>
         <w:tc>
           <w:tcPr>
-            <w:tcW w:type="dxa" w:w="1872"/>
+            <w:tcW w:type="dxa" w:w="864"/>
           </w:tcPr>
           <w:p>
             <w:r/>
@@ -367,13 +427,13 @@
                 <w:rFonts w:ascii="Times New Roman" w:hAnsi="Times New Roman"/>
                 <w:sz w:val="16"/>
               </w:rPr>
-              <w:t>ros_failure</w:t>
+              <w:t>0.717</w:t>
             </w:r>
           </w:p>
         </w:tc>
         <w:tc>
           <w:tcPr>
-            <w:tcW w:type="dxa" w:w="3456"/>
+            <w:tcW w:type="dxa" w:w="1296"/>
           </w:tcPr>
           <w:p>
             <w:r/>
@@ -382,13 +442,13 @@
                 <w:rFonts w:ascii="Times New Roman" w:hAnsi="Times New Roman"/>
                 <w:sz w:val="16"/>
               </w:rPr>
-              <w:t>NOT ros</w:t>
+              <w:t>0.534</w:t>
             </w:r>
           </w:p>
         </w:tc>
         <w:tc>
           <w:tcPr>
-            <w:tcW w:type="dxa" w:w="4320"/>
+            <w:tcW w:type="dxa" w:w="1296"/>
           </w:tcPr>
           <w:p>
             <w:r/>
@@ -397,7 +457,7 @@
                 <w:rFonts w:ascii="Times New Roman" w:hAnsi="Times New Roman"/>
                 <w:sz w:val="16"/>
               </w:rPr>
-              <w:t>ROS dose below threshold</w:t>
+              <w:t>0.476</w:t>
             </w:r>
           </w:p>
         </w:tc>
@@ -405,7 +465,7 @@
       <w:tr>
         <w:tc>
           <w:tcPr>
-            <w:tcW w:type="dxa" w:w="1872"/>
+            <w:tcW w:type="dxa" w:w="2160"/>
           </w:tcPr>
           <w:p>
             <w:r/>
@@ -414,13 +474,13 @@
                 <w:rFonts w:ascii="Times New Roman" w:hAnsi="Times New Roman"/>
                 <w:sz w:val="16"/>
               </w:rPr>
-              <w:t>overheat_failure</w:t>
+              <w:t>locked validation (seeds 20260720-22)</w:t>
             </w:r>
           </w:p>
         </w:tc>
         <w:tc>
           <w:tcPr>
-            <w:tcW w:type="dxa" w:w="3456"/>
+            <w:tcW w:type="dxa" w:w="1296"/>
           </w:tcPr>
           <w:p>
             <w:r/>
@@ -429,13 +489,13 @@
                 <w:rFonts w:ascii="Times New Roman" w:hAnsi="Times New Roman"/>
                 <w:sz w:val="16"/>
               </w:rPr>
-              <w:t>NOT safe_heat</w:t>
+              <w:t>seed_20260720</w:t>
             </w:r>
           </w:p>
         </w:tc>
         <w:tc>
           <w:tcPr>
-            <w:tcW w:type="dxa" w:w="4320"/>
+            <w:tcW w:type="dxa" w:w="1584"/>
           </w:tcPr>
           <w:p>
             <w:r/>
@@ -444,7 +504,1458 @@
                 <w:rFonts w:ascii="Times New Roman" w:hAnsi="Times New Roman"/>
                 <w:sz w:val="16"/>
               </w:rPr>
-              <w:t>thermal injury</w:t>
+              <w:t>slow_recovery</w:t>
+            </w:r>
+          </w:p>
+        </w:tc>
+        <w:tc>
+          <w:tcPr>
+            <w:tcW w:type="dxa" w:w="576"/>
+          </w:tcPr>
+          <w:p>
+            <w:r/>
+            <w:r>
+              <w:rPr>
+                <w:rFonts w:ascii="Times New Roman" w:hAnsi="Times New Roman"/>
+                <w:sz w:val="16"/>
+              </w:rPr>
+              <w:t>384</w:t>
+            </w:r>
+          </w:p>
+        </w:tc>
+        <w:tc>
+          <w:tcPr>
+            <w:tcW w:type="dxa" w:w="864"/>
+          </w:tcPr>
+          <w:p>
+            <w:r/>
+            <w:r>
+              <w:rPr>
+                <w:rFonts w:ascii="Times New Roman" w:hAnsi="Times New Roman"/>
+                <w:sz w:val="16"/>
+              </w:rPr>
+              <w:t>0.681</w:t>
+            </w:r>
+          </w:p>
+        </w:tc>
+        <w:tc>
+          <w:tcPr>
+            <w:tcW w:type="dxa" w:w="1296"/>
+          </w:tcPr>
+          <w:p>
+            <w:r/>
+            <w:r>
+              <w:rPr>
+                <w:rFonts w:ascii="Times New Roman" w:hAnsi="Times New Roman"/>
+                <w:sz w:val="16"/>
+              </w:rPr>
+              <w:t>0.620</w:t>
+            </w:r>
+          </w:p>
+        </w:tc>
+        <w:tc>
+          <w:tcPr>
+            <w:tcW w:type="dxa" w:w="1296"/>
+          </w:tcPr>
+          <w:p>
+            <w:r/>
+            <w:r>
+              <w:rPr>
+                <w:rFonts w:ascii="Times New Roman" w:hAnsi="Times New Roman"/>
+                <w:sz w:val="16"/>
+              </w:rPr>
+              <w:t>0.534</w:t>
+            </w:r>
+          </w:p>
+        </w:tc>
+      </w:tr>
+      <w:tr>
+        <w:tc>
+          <w:tcPr>
+            <w:tcW w:type="dxa" w:w="2160"/>
+          </w:tcPr>
+          <w:p>
+            <w:r/>
+            <w:r>
+              <w:rPr>
+                <w:rFonts w:ascii="Times New Roman" w:hAnsi="Times New Roman"/>
+                <w:sz w:val="16"/>
+              </w:rPr>
+              <w:t>locked validation (seeds 20260720-22)</w:t>
+            </w:r>
+          </w:p>
+        </w:tc>
+        <w:tc>
+          <w:tcPr>
+            <w:tcW w:type="dxa" w:w="1296"/>
+          </w:tcPr>
+          <w:p>
+            <w:r/>
+            <w:r>
+              <w:rPr>
+                <w:rFonts w:ascii="Times New Roman" w:hAnsi="Times New Roman"/>
+                <w:sz w:val="16"/>
+              </w:rPr>
+              <w:t>seed_20260721</w:t>
+            </w:r>
+          </w:p>
+        </w:tc>
+        <w:tc>
+          <w:tcPr>
+            <w:tcW w:type="dxa" w:w="1584"/>
+          </w:tcPr>
+          <w:p>
+            <w:r/>
+            <w:r>
+              <w:rPr>
+                <w:rFonts w:ascii="Times New Roman" w:hAnsi="Times New Roman"/>
+                <w:sz w:val="16"/>
+              </w:rPr>
+              <w:t>baseline</w:t>
+            </w:r>
+          </w:p>
+        </w:tc>
+        <w:tc>
+          <w:tcPr>
+            <w:tcW w:type="dxa" w:w="576"/>
+          </w:tcPr>
+          <w:p>
+            <w:r/>
+            <w:r>
+              <w:rPr>
+                <w:rFonts w:ascii="Times New Roman" w:hAnsi="Times New Roman"/>
+                <w:sz w:val="16"/>
+              </w:rPr>
+              <w:t>384</w:t>
+            </w:r>
+          </w:p>
+        </w:tc>
+        <w:tc>
+          <w:tcPr>
+            <w:tcW w:type="dxa" w:w="864"/>
+          </w:tcPr>
+          <w:p>
+            <w:r/>
+            <w:r>
+              <w:rPr>
+                <w:rFonts w:ascii="Times New Roman" w:hAnsi="Times New Roman"/>
+                <w:sz w:val="16"/>
+              </w:rPr>
+              <w:t>0.664</w:t>
+            </w:r>
+          </w:p>
+        </w:tc>
+        <w:tc>
+          <w:tcPr>
+            <w:tcW w:type="dxa" w:w="1296"/>
+          </w:tcPr>
+          <w:p>
+            <w:r/>
+            <w:r>
+              <w:rPr>
+                <w:rFonts w:ascii="Times New Roman" w:hAnsi="Times New Roman"/>
+                <w:sz w:val="16"/>
+              </w:rPr>
+              <w:t>0.542</w:t>
+            </w:r>
+          </w:p>
+        </w:tc>
+        <w:tc>
+          <w:tcPr>
+            <w:tcW w:type="dxa" w:w="1296"/>
+          </w:tcPr>
+          <w:p>
+            <w:r/>
+            <w:r>
+              <w:rPr>
+                <w:rFonts w:ascii="Times New Roman" w:hAnsi="Times New Roman"/>
+                <w:sz w:val="16"/>
+              </w:rPr>
+              <w:t>0.555</w:t>
+            </w:r>
+          </w:p>
+        </w:tc>
+      </w:tr>
+      <w:tr>
+        <w:tc>
+          <w:tcPr>
+            <w:tcW w:type="dxa" w:w="2160"/>
+          </w:tcPr>
+          <w:p>
+            <w:r/>
+            <w:r>
+              <w:rPr>
+                <w:rFonts w:ascii="Times New Roman" w:hAnsi="Times New Roman"/>
+                <w:sz w:val="16"/>
+              </w:rPr>
+              <w:t>locked validation (seeds 20260720-22)</w:t>
+            </w:r>
+          </w:p>
+        </w:tc>
+        <w:tc>
+          <w:tcPr>
+            <w:tcW w:type="dxa" w:w="1296"/>
+          </w:tcPr>
+          <w:p>
+            <w:r/>
+            <w:r>
+              <w:rPr>
+                <w:rFonts w:ascii="Times New Roman" w:hAnsi="Times New Roman"/>
+                <w:sz w:val="16"/>
+              </w:rPr>
+              <w:t>seed_20260721</w:t>
+            </w:r>
+          </w:p>
+        </w:tc>
+        <w:tc>
+          <w:tcPr>
+            <w:tcW w:type="dxa" w:w="1584"/>
+          </w:tcPr>
+          <w:p>
+            <w:r/>
+            <w:r>
+              <w:rPr>
+                <w:rFonts w:ascii="Times New Roman" w:hAnsi="Times New Roman"/>
+                <w:sz w:val="16"/>
+              </w:rPr>
+              <w:t>large_geometry</w:t>
+            </w:r>
+          </w:p>
+        </w:tc>
+        <w:tc>
+          <w:tcPr>
+            <w:tcW w:type="dxa" w:w="576"/>
+          </w:tcPr>
+          <w:p>
+            <w:r/>
+            <w:r>
+              <w:rPr>
+                <w:rFonts w:ascii="Times New Roman" w:hAnsi="Times New Roman"/>
+                <w:sz w:val="16"/>
+              </w:rPr>
+              <w:t>384</w:t>
+            </w:r>
+          </w:p>
+        </w:tc>
+        <w:tc>
+          <w:tcPr>
+            <w:tcW w:type="dxa" w:w="864"/>
+          </w:tcPr>
+          <w:p>
+            <w:r/>
+            <w:r>
+              <w:rPr>
+                <w:rFonts w:ascii="Times New Roman" w:hAnsi="Times New Roman"/>
+                <w:sz w:val="16"/>
+              </w:rPr>
+              <w:t>0.695</w:t>
+            </w:r>
+          </w:p>
+        </w:tc>
+        <w:tc>
+          <w:tcPr>
+            <w:tcW w:type="dxa" w:w="1296"/>
+          </w:tcPr>
+          <w:p>
+            <w:r/>
+            <w:r>
+              <w:rPr>
+                <w:rFonts w:ascii="Times New Roman" w:hAnsi="Times New Roman"/>
+                <w:sz w:val="16"/>
+              </w:rPr>
+              <w:t>0.542</w:t>
+            </w:r>
+          </w:p>
+        </w:tc>
+        <w:tc>
+          <w:tcPr>
+            <w:tcW w:type="dxa" w:w="1296"/>
+          </w:tcPr>
+          <w:p>
+            <w:r/>
+            <w:r>
+              <w:rPr>
+                <w:rFonts w:ascii="Times New Roman" w:hAnsi="Times New Roman"/>
+                <w:sz w:val="16"/>
+              </w:rPr>
+              <w:t>0.596</w:t>
+            </w:r>
+          </w:p>
+        </w:tc>
+      </w:tr>
+      <w:tr>
+        <w:tc>
+          <w:tcPr>
+            <w:tcW w:type="dxa" w:w="2160"/>
+          </w:tcPr>
+          <w:p>
+            <w:r/>
+            <w:r>
+              <w:rPr>
+                <w:rFonts w:ascii="Times New Roman" w:hAnsi="Times New Roman"/>
+                <w:sz w:val="16"/>
+              </w:rPr>
+              <w:t>locked validation (seeds 20260720-22)</w:t>
+            </w:r>
+          </w:p>
+        </w:tc>
+        <w:tc>
+          <w:tcPr>
+            <w:tcW w:type="dxa" w:w="1296"/>
+          </w:tcPr>
+          <w:p>
+            <w:r/>
+            <w:r>
+              <w:rPr>
+                <w:rFonts w:ascii="Times New Roman" w:hAnsi="Times New Roman"/>
+                <w:sz w:val="16"/>
+              </w:rPr>
+              <w:t>seed_20260721</w:t>
+            </w:r>
+          </w:p>
+        </w:tc>
+        <w:tc>
+          <w:tcPr>
+            <w:tcW w:type="dxa" w:w="1584"/>
+          </w:tcPr>
+          <w:p>
+            <w:r/>
+            <w:r>
+              <w:rPr>
+                <w:rFonts w:ascii="Times New Roman" w:hAnsi="Times New Roman"/>
+                <w:sz w:val="16"/>
+              </w:rPr>
+              <w:t>low_photosensitizer</w:t>
+            </w:r>
+          </w:p>
+        </w:tc>
+        <w:tc>
+          <w:tcPr>
+            <w:tcW w:type="dxa" w:w="576"/>
+          </w:tcPr>
+          <w:p>
+            <w:r/>
+            <w:r>
+              <w:rPr>
+                <w:rFonts w:ascii="Times New Roman" w:hAnsi="Times New Roman"/>
+                <w:sz w:val="16"/>
+              </w:rPr>
+              <w:t>384</w:t>
+            </w:r>
+          </w:p>
+        </w:tc>
+        <w:tc>
+          <w:tcPr>
+            <w:tcW w:type="dxa" w:w="864"/>
+          </w:tcPr>
+          <w:p>
+            <w:r/>
+            <w:r>
+              <w:rPr>
+                <w:rFonts w:ascii="Times New Roman" w:hAnsi="Times New Roman"/>
+                <w:sz w:val="16"/>
+              </w:rPr>
+              <w:t>0.705</w:t>
+            </w:r>
+          </w:p>
+        </w:tc>
+        <w:tc>
+          <w:tcPr>
+            <w:tcW w:type="dxa" w:w="1296"/>
+          </w:tcPr>
+          <w:p>
+            <w:r/>
+            <w:r>
+              <w:rPr>
+                <w:rFonts w:ascii="Times New Roman" w:hAnsi="Times New Roman"/>
+                <w:sz w:val="16"/>
+              </w:rPr>
+              <w:t>0.409</w:t>
+            </w:r>
+          </w:p>
+        </w:tc>
+        <w:tc>
+          <w:tcPr>
+            <w:tcW w:type="dxa" w:w="1296"/>
+          </w:tcPr>
+          <w:p>
+            <w:r/>
+            <w:r>
+              <w:rPr>
+                <w:rFonts w:ascii="Times New Roman" w:hAnsi="Times New Roman"/>
+                <w:sz w:val="16"/>
+              </w:rPr>
+              <w:t>0.478</w:t>
+            </w:r>
+          </w:p>
+        </w:tc>
+      </w:tr>
+      <w:tr>
+        <w:tc>
+          <w:tcPr>
+            <w:tcW w:type="dxa" w:w="2160"/>
+          </w:tcPr>
+          <w:p>
+            <w:r/>
+            <w:r>
+              <w:rPr>
+                <w:rFonts w:ascii="Times New Roman" w:hAnsi="Times New Roman"/>
+                <w:sz w:val="16"/>
+              </w:rPr>
+              <w:t>locked validation (seeds 20260720-22)</w:t>
+            </w:r>
+          </w:p>
+        </w:tc>
+        <w:tc>
+          <w:tcPr>
+            <w:tcW w:type="dxa" w:w="1296"/>
+          </w:tcPr>
+          <w:p>
+            <w:r/>
+            <w:r>
+              <w:rPr>
+                <w:rFonts w:ascii="Times New Roman" w:hAnsi="Times New Roman"/>
+                <w:sz w:val="16"/>
+              </w:rPr>
+              <w:t>seed_20260721</w:t>
+            </w:r>
+          </w:p>
+        </w:tc>
+        <w:tc>
+          <w:tcPr>
+            <w:tcW w:type="dxa" w:w="1584"/>
+          </w:tcPr>
+          <w:p>
+            <w:r/>
+            <w:r>
+              <w:rPr>
+                <w:rFonts w:ascii="Times New Roman" w:hAnsi="Times New Roman"/>
+                <w:sz w:val="16"/>
+              </w:rPr>
+              <w:t>slow_recovery</w:t>
+            </w:r>
+          </w:p>
+        </w:tc>
+        <w:tc>
+          <w:tcPr>
+            <w:tcW w:type="dxa" w:w="576"/>
+          </w:tcPr>
+          <w:p>
+            <w:r/>
+            <w:r>
+              <w:rPr>
+                <w:rFonts w:ascii="Times New Roman" w:hAnsi="Times New Roman"/>
+                <w:sz w:val="16"/>
+              </w:rPr>
+              <w:t>384</w:t>
+            </w:r>
+          </w:p>
+        </w:tc>
+        <w:tc>
+          <w:tcPr>
+            <w:tcW w:type="dxa" w:w="864"/>
+          </w:tcPr>
+          <w:p>
+            <w:r/>
+            <w:r>
+              <w:rPr>
+                <w:rFonts w:ascii="Times New Roman" w:hAnsi="Times New Roman"/>
+                <w:sz w:val="16"/>
+              </w:rPr>
+              <w:t>0.691</w:t>
+            </w:r>
+          </w:p>
+        </w:tc>
+        <w:tc>
+          <w:tcPr>
+            <w:tcW w:type="dxa" w:w="1296"/>
+          </w:tcPr>
+          <w:p>
+            <w:r/>
+            <w:r>
+              <w:rPr>
+                <w:rFonts w:ascii="Times New Roman" w:hAnsi="Times New Roman"/>
+                <w:sz w:val="16"/>
+              </w:rPr>
+              <w:t>0.568</w:t>
+            </w:r>
+          </w:p>
+        </w:tc>
+        <w:tc>
+          <w:tcPr>
+            <w:tcW w:type="dxa" w:w="1296"/>
+          </w:tcPr>
+          <w:p>
+            <w:r/>
+            <w:r>
+              <w:rPr>
+                <w:rFonts w:ascii="Times New Roman" w:hAnsi="Times New Roman"/>
+                <w:sz w:val="16"/>
+              </w:rPr>
+              <w:t>0.533</w:t>
+            </w:r>
+          </w:p>
+        </w:tc>
+      </w:tr>
+      <w:tr>
+        <w:tc>
+          <w:tcPr>
+            <w:tcW w:type="dxa" w:w="2160"/>
+          </w:tcPr>
+          <w:p>
+            <w:r/>
+            <w:r>
+              <w:rPr>
+                <w:rFonts w:ascii="Times New Roman" w:hAnsi="Times New Roman"/>
+                <w:sz w:val="16"/>
+              </w:rPr>
+              <w:t>locked validation (seeds 20260720-22)</w:t>
+            </w:r>
+          </w:p>
+        </w:tc>
+        <w:tc>
+          <w:tcPr>
+            <w:tcW w:type="dxa" w:w="1296"/>
+          </w:tcPr>
+          <w:p>
+            <w:r/>
+            <w:r>
+              <w:rPr>
+                <w:rFonts w:ascii="Times New Roman" w:hAnsi="Times New Roman"/>
+                <w:sz w:val="16"/>
+              </w:rPr>
+              <w:t>seed_20260722</w:t>
+            </w:r>
+          </w:p>
+        </w:tc>
+        <w:tc>
+          <w:tcPr>
+            <w:tcW w:type="dxa" w:w="1584"/>
+          </w:tcPr>
+          <w:p>
+            <w:r/>
+            <w:r>
+              <w:rPr>
+                <w:rFonts w:ascii="Times New Roman" w:hAnsi="Times New Roman"/>
+                <w:sz w:val="16"/>
+              </w:rPr>
+              <w:t>baseline</w:t>
+            </w:r>
+          </w:p>
+        </w:tc>
+        <w:tc>
+          <w:tcPr>
+            <w:tcW w:type="dxa" w:w="576"/>
+          </w:tcPr>
+          <w:p>
+            <w:r/>
+            <w:r>
+              <w:rPr>
+                <w:rFonts w:ascii="Times New Roman" w:hAnsi="Times New Roman"/>
+                <w:sz w:val="16"/>
+              </w:rPr>
+              <w:t>384</w:t>
+            </w:r>
+          </w:p>
+        </w:tc>
+        <w:tc>
+          <w:tcPr>
+            <w:tcW w:type="dxa" w:w="864"/>
+          </w:tcPr>
+          <w:p>
+            <w:r/>
+            <w:r>
+              <w:rPr>
+                <w:rFonts w:ascii="Times New Roman" w:hAnsi="Times New Roman"/>
+                <w:sz w:val="16"/>
+              </w:rPr>
+              <w:t>0.590</w:t>
+            </w:r>
+          </w:p>
+        </w:tc>
+        <w:tc>
+          <w:tcPr>
+            <w:tcW w:type="dxa" w:w="1296"/>
+          </w:tcPr>
+          <w:p>
+            <w:r/>
+            <w:r>
+              <w:rPr>
+                <w:rFonts w:ascii="Times New Roman" w:hAnsi="Times New Roman"/>
+                <w:sz w:val="16"/>
+              </w:rPr>
+              <w:t>0.625</w:t>
+            </w:r>
+          </w:p>
+        </w:tc>
+        <w:tc>
+          <w:tcPr>
+            <w:tcW w:type="dxa" w:w="1296"/>
+          </w:tcPr>
+          <w:p>
+            <w:r/>
+            <w:r>
+              <w:rPr>
+                <w:rFonts w:ascii="Times New Roman" w:hAnsi="Times New Roman"/>
+                <w:sz w:val="16"/>
+              </w:rPr>
+              <w:t>0.556</w:t>
+            </w:r>
+          </w:p>
+        </w:tc>
+      </w:tr>
+      <w:tr>
+        <w:tc>
+          <w:tcPr>
+            <w:tcW w:type="dxa" w:w="2160"/>
+          </w:tcPr>
+          <w:p>
+            <w:r/>
+            <w:r>
+              <w:rPr>
+                <w:rFonts w:ascii="Times New Roman" w:hAnsi="Times New Roman"/>
+                <w:sz w:val="16"/>
+              </w:rPr>
+              <w:t>locked validation (seeds 20260720-22)</w:t>
+            </w:r>
+          </w:p>
+        </w:tc>
+        <w:tc>
+          <w:tcPr>
+            <w:tcW w:type="dxa" w:w="1296"/>
+          </w:tcPr>
+          <w:p>
+            <w:r/>
+            <w:r>
+              <w:rPr>
+                <w:rFonts w:ascii="Times New Roman" w:hAnsi="Times New Roman"/>
+                <w:sz w:val="16"/>
+              </w:rPr>
+              <w:t>seed_20260722</w:t>
+            </w:r>
+          </w:p>
+        </w:tc>
+        <w:tc>
+          <w:tcPr>
+            <w:tcW w:type="dxa" w:w="1584"/>
+          </w:tcPr>
+          <w:p>
+            <w:r/>
+            <w:r>
+              <w:rPr>
+                <w:rFonts w:ascii="Times New Roman" w:hAnsi="Times New Roman"/>
+                <w:sz w:val="16"/>
+              </w:rPr>
+              <w:t>large_geometry</w:t>
+            </w:r>
+          </w:p>
+        </w:tc>
+        <w:tc>
+          <w:tcPr>
+            <w:tcW w:type="dxa" w:w="576"/>
+          </w:tcPr>
+          <w:p>
+            <w:r/>
+            <w:r>
+              <w:rPr>
+                <w:rFonts w:ascii="Times New Roman" w:hAnsi="Times New Roman"/>
+                <w:sz w:val="16"/>
+              </w:rPr>
+              <w:t>384</w:t>
+            </w:r>
+          </w:p>
+        </w:tc>
+        <w:tc>
+          <w:tcPr>
+            <w:tcW w:type="dxa" w:w="864"/>
+          </w:tcPr>
+          <w:p>
+            <w:r/>
+            <w:r>
+              <w:rPr>
+                <w:rFonts w:ascii="Times New Roman" w:hAnsi="Times New Roman"/>
+                <w:sz w:val="16"/>
+              </w:rPr>
+              <w:t>0.607</w:t>
+            </w:r>
+          </w:p>
+        </w:tc>
+        <w:tc>
+          <w:tcPr>
+            <w:tcW w:type="dxa" w:w="1296"/>
+          </w:tcPr>
+          <w:p>
+            <w:r/>
+            <w:r>
+              <w:rPr>
+                <w:rFonts w:ascii="Times New Roman" w:hAnsi="Times New Roman"/>
+                <w:sz w:val="16"/>
+              </w:rPr>
+              <w:t>0.633</w:t>
+            </w:r>
+          </w:p>
+        </w:tc>
+        <w:tc>
+          <w:tcPr>
+            <w:tcW w:type="dxa" w:w="1296"/>
+          </w:tcPr>
+          <w:p>
+            <w:r/>
+            <w:r>
+              <w:rPr>
+                <w:rFonts w:ascii="Times New Roman" w:hAnsi="Times New Roman"/>
+                <w:sz w:val="16"/>
+              </w:rPr>
+              <w:t>0.599</w:t>
+            </w:r>
+          </w:p>
+        </w:tc>
+      </w:tr>
+      <w:tr>
+        <w:tc>
+          <w:tcPr>
+            <w:tcW w:type="dxa" w:w="2160"/>
+          </w:tcPr>
+          <w:p>
+            <w:r/>
+            <w:r>
+              <w:rPr>
+                <w:rFonts w:ascii="Times New Roman" w:hAnsi="Times New Roman"/>
+                <w:sz w:val="16"/>
+              </w:rPr>
+              <w:t>locked validation (seeds 20260720-22)</w:t>
+            </w:r>
+          </w:p>
+        </w:tc>
+        <w:tc>
+          <w:tcPr>
+            <w:tcW w:type="dxa" w:w="1296"/>
+          </w:tcPr>
+          <w:p>
+            <w:r/>
+            <w:r>
+              <w:rPr>
+                <w:rFonts w:ascii="Times New Roman" w:hAnsi="Times New Roman"/>
+                <w:sz w:val="16"/>
+              </w:rPr>
+              <w:t>seed_20260722</w:t>
+            </w:r>
+          </w:p>
+        </w:tc>
+        <w:tc>
+          <w:tcPr>
+            <w:tcW w:type="dxa" w:w="1584"/>
+          </w:tcPr>
+          <w:p>
+            <w:r/>
+            <w:r>
+              <w:rPr>
+                <w:rFonts w:ascii="Times New Roman" w:hAnsi="Times New Roman"/>
+                <w:sz w:val="16"/>
+              </w:rPr>
+              <w:t>low_photosensitizer</w:t>
+            </w:r>
+          </w:p>
+        </w:tc>
+        <w:tc>
+          <w:tcPr>
+            <w:tcW w:type="dxa" w:w="576"/>
+          </w:tcPr>
+          <w:p>
+            <w:r/>
+            <w:r>
+              <w:rPr>
+                <w:rFonts w:ascii="Times New Roman" w:hAnsi="Times New Roman"/>
+                <w:sz w:val="16"/>
+              </w:rPr>
+              <w:t>384</w:t>
+            </w:r>
+          </w:p>
+        </w:tc>
+        <w:tc>
+          <w:tcPr>
+            <w:tcW w:type="dxa" w:w="864"/>
+          </w:tcPr>
+          <w:p>
+            <w:r/>
+            <w:r>
+              <w:rPr>
+                <w:rFonts w:ascii="Times New Roman" w:hAnsi="Times New Roman"/>
+                <w:sz w:val="16"/>
+              </w:rPr>
+              <w:t>0.702</w:t>
+            </w:r>
+          </w:p>
+        </w:tc>
+        <w:tc>
+          <w:tcPr>
+            <w:tcW w:type="dxa" w:w="1296"/>
+          </w:tcPr>
+          <w:p>
+            <w:r/>
+            <w:r>
+              <w:rPr>
+                <w:rFonts w:ascii="Times New Roman" w:hAnsi="Times New Roman"/>
+                <w:sz w:val="16"/>
+              </w:rPr>
+              <w:t>0.474</w:t>
+            </w:r>
+          </w:p>
+        </w:tc>
+        <w:tc>
+          <w:tcPr>
+            <w:tcW w:type="dxa" w:w="1296"/>
+          </w:tcPr>
+          <w:p>
+            <w:r/>
+            <w:r>
+              <w:rPr>
+                <w:rFonts w:ascii="Times New Roman" w:hAnsi="Times New Roman"/>
+                <w:sz w:val="16"/>
+              </w:rPr>
+              <w:t>0.469</w:t>
+            </w:r>
+          </w:p>
+        </w:tc>
+      </w:tr>
+      <w:tr>
+        <w:tc>
+          <w:tcPr>
+            <w:tcW w:type="dxa" w:w="2160"/>
+          </w:tcPr>
+          <w:p>
+            <w:r/>
+            <w:r>
+              <w:rPr>
+                <w:rFonts w:ascii="Times New Roman" w:hAnsi="Times New Roman"/>
+                <w:sz w:val="16"/>
+              </w:rPr>
+              <w:t>locked validation (seeds 20260720-22)</w:t>
+            </w:r>
+          </w:p>
+        </w:tc>
+        <w:tc>
+          <w:tcPr>
+            <w:tcW w:type="dxa" w:w="1296"/>
+          </w:tcPr>
+          <w:p>
+            <w:r/>
+            <w:r>
+              <w:rPr>
+                <w:rFonts w:ascii="Times New Roman" w:hAnsi="Times New Roman"/>
+                <w:sz w:val="16"/>
+              </w:rPr>
+              <w:t>seed_20260722</w:t>
+            </w:r>
+          </w:p>
+        </w:tc>
+        <w:tc>
+          <w:tcPr>
+            <w:tcW w:type="dxa" w:w="1584"/>
+          </w:tcPr>
+          <w:p>
+            <w:r/>
+            <w:r>
+              <w:rPr>
+                <w:rFonts w:ascii="Times New Roman" w:hAnsi="Times New Roman"/>
+                <w:sz w:val="16"/>
+              </w:rPr>
+              <w:t>slow_recovery</w:t>
+            </w:r>
+          </w:p>
+        </w:tc>
+        <w:tc>
+          <w:tcPr>
+            <w:tcW w:type="dxa" w:w="576"/>
+          </w:tcPr>
+          <w:p>
+            <w:r/>
+            <w:r>
+              <w:rPr>
+                <w:rFonts w:ascii="Times New Roman" w:hAnsi="Times New Roman"/>
+                <w:sz w:val="16"/>
+              </w:rPr>
+              <w:t>384</w:t>
+            </w:r>
+          </w:p>
+        </w:tc>
+        <w:tc>
+          <w:tcPr>
+            <w:tcW w:type="dxa" w:w="864"/>
+          </w:tcPr>
+          <w:p>
+            <w:r/>
+            <w:r>
+              <w:rPr>
+                <w:rFonts w:ascii="Times New Roman" w:hAnsi="Times New Roman"/>
+                <w:sz w:val="16"/>
+              </w:rPr>
+              <w:t>0.709</w:t>
+            </w:r>
+          </w:p>
+        </w:tc>
+        <w:tc>
+          <w:tcPr>
+            <w:tcW w:type="dxa" w:w="1296"/>
+          </w:tcPr>
+          <w:p>
+            <w:r/>
+            <w:r>
+              <w:rPr>
+                <w:rFonts w:ascii="Times New Roman" w:hAnsi="Times New Roman"/>
+                <w:sz w:val="16"/>
+              </w:rPr>
+              <w:t>0.591</w:t>
+            </w:r>
+          </w:p>
+        </w:tc>
+        <w:tc>
+          <w:tcPr>
+            <w:tcW w:type="dxa" w:w="1296"/>
+          </w:tcPr>
+          <w:p>
+            <w:r/>
+            <w:r>
+              <w:rPr>
+                <w:rFonts w:ascii="Times New Roman" w:hAnsi="Times New Roman"/>
+                <w:sz w:val="16"/>
+              </w:rPr>
+              <w:t>0.528</w:t>
+            </w:r>
+          </w:p>
+        </w:tc>
+      </w:tr>
+      <w:tr>
+        <w:tc>
+          <w:tcPr>
+            <w:tcW w:type="dxa" w:w="2160"/>
+          </w:tcPr>
+          <w:p>
+            <w:r/>
+            <w:r>
+              <w:rPr>
+                <w:rFonts w:ascii="Times New Roman" w:hAnsi="Times New Roman"/>
+                <w:sz w:val="16"/>
+              </w:rPr>
+              <w:t>external held-out (different seed)</w:t>
+            </w:r>
+          </w:p>
+        </w:tc>
+        <w:tc>
+          <w:tcPr>
+            <w:tcW w:type="dxa" w:w="1296"/>
+          </w:tcPr>
+          <w:p>
+            <w:r/>
+            <w:r>
+              <w:rPr>
+                <w:rFonts w:ascii="Times New Roman" w:hAnsi="Times New Roman"/>
+                <w:sz w:val="16"/>
+              </w:rPr>
+              <w:t>seed_20260713</w:t>
+            </w:r>
+          </w:p>
+        </w:tc>
+        <w:tc>
+          <w:tcPr>
+            <w:tcW w:type="dxa" w:w="1584"/>
+          </w:tcPr>
+          <w:p>
+            <w:r/>
+            <w:r>
+              <w:rPr>
+                <w:rFonts w:ascii="Times New Roman" w:hAnsi="Times New Roman"/>
+                <w:sz w:val="16"/>
+              </w:rPr>
+              <w:t>baseline</w:t>
+            </w:r>
+          </w:p>
+        </w:tc>
+        <w:tc>
+          <w:tcPr>
+            <w:tcW w:type="dxa" w:w="576"/>
+          </w:tcPr>
+          <w:p>
+            <w:r/>
+            <w:r>
+              <w:rPr>
+                <w:rFonts w:ascii="Times New Roman" w:hAnsi="Times New Roman"/>
+                <w:sz w:val="16"/>
+              </w:rPr>
+              <w:t>960</w:t>
+            </w:r>
+          </w:p>
+        </w:tc>
+        <w:tc>
+          <w:tcPr>
+            <w:tcW w:type="dxa" w:w="864"/>
+          </w:tcPr>
+          <w:p>
+            <w:r/>
+            <w:r>
+              <w:rPr>
+                <w:rFonts w:ascii="Times New Roman" w:hAnsi="Times New Roman"/>
+                <w:sz w:val="16"/>
+              </w:rPr>
+              <w:t>0.586</w:t>
+            </w:r>
+          </w:p>
+        </w:tc>
+        <w:tc>
+          <w:tcPr>
+            <w:tcW w:type="dxa" w:w="1296"/>
+          </w:tcPr>
+          <w:p>
+            <w:r/>
+            <w:r>
+              <w:rPr>
+                <w:rFonts w:ascii="Times New Roman" w:hAnsi="Times New Roman"/>
+                <w:sz w:val="16"/>
+              </w:rPr>
+              <w:t>0.525</w:t>
+            </w:r>
+          </w:p>
+        </w:tc>
+        <w:tc>
+          <w:tcPr>
+            <w:tcW w:type="dxa" w:w="1296"/>
+          </w:tcPr>
+          <w:p>
+            <w:r/>
+            <w:r>
+              <w:rPr>
+                <w:rFonts w:ascii="Times New Roman" w:hAnsi="Times New Roman"/>
+                <w:sz w:val="16"/>
+              </w:rPr>
+              <w:t>0.497</w:t>
+            </w:r>
+          </w:p>
+        </w:tc>
+      </w:tr>
+      <w:tr>
+        <w:tc>
+          <w:tcPr>
+            <w:tcW w:type="dxa" w:w="2160"/>
+          </w:tcPr>
+          <w:p>
+            <w:r/>
+            <w:r>
+              <w:rPr>
+                <w:rFonts w:ascii="Times New Roman" w:hAnsi="Times New Roman"/>
+                <w:sz w:val="16"/>
+              </w:rPr>
+              <w:t>external held-out (different seed)</w:t>
+            </w:r>
+          </w:p>
+        </w:tc>
+        <w:tc>
+          <w:tcPr>
+            <w:tcW w:type="dxa" w:w="1296"/>
+          </w:tcPr>
+          <w:p>
+            <w:r/>
+            <w:r>
+              <w:rPr>
+                <w:rFonts w:ascii="Times New Roman" w:hAnsi="Times New Roman"/>
+                <w:sz w:val="16"/>
+              </w:rPr>
+              <w:t>seed_20260713</w:t>
+            </w:r>
+          </w:p>
+        </w:tc>
+        <w:tc>
+          <w:tcPr>
+            <w:tcW w:type="dxa" w:w="1584"/>
+          </w:tcPr>
+          <w:p>
+            <w:r/>
+            <w:r>
+              <w:rPr>
+                <w:rFonts w:ascii="Times New Roman" w:hAnsi="Times New Roman"/>
+                <w:sz w:val="16"/>
+              </w:rPr>
+              <w:t>large_geometry</w:t>
+            </w:r>
+          </w:p>
+        </w:tc>
+        <w:tc>
+          <w:tcPr>
+            <w:tcW w:type="dxa" w:w="576"/>
+          </w:tcPr>
+          <w:p>
+            <w:r/>
+            <w:r>
+              <w:rPr>
+                <w:rFonts w:ascii="Times New Roman" w:hAnsi="Times New Roman"/>
+                <w:sz w:val="16"/>
+              </w:rPr>
+              <w:t>960</w:t>
+            </w:r>
+          </w:p>
+        </w:tc>
+        <w:tc>
+          <w:tcPr>
+            <w:tcW w:type="dxa" w:w="864"/>
+          </w:tcPr>
+          <w:p>
+            <w:r/>
+            <w:r>
+              <w:rPr>
+                <w:rFonts w:ascii="Times New Roman" w:hAnsi="Times New Roman"/>
+                <w:sz w:val="16"/>
+              </w:rPr>
+              <w:t>0.598</w:t>
+            </w:r>
+          </w:p>
+        </w:tc>
+        <w:tc>
+          <w:tcPr>
+            <w:tcW w:type="dxa" w:w="1296"/>
+          </w:tcPr>
+          <w:p>
+            <w:r/>
+            <w:r>
+              <w:rPr>
+                <w:rFonts w:ascii="Times New Roman" w:hAnsi="Times New Roman"/>
+                <w:sz w:val="16"/>
+              </w:rPr>
+              <w:t>0.521</w:t>
+            </w:r>
+          </w:p>
+        </w:tc>
+        <w:tc>
+          <w:tcPr>
+            <w:tcW w:type="dxa" w:w="1296"/>
+          </w:tcPr>
+          <w:p>
+            <w:r/>
+            <w:r>
+              <w:rPr>
+                <w:rFonts w:ascii="Times New Roman" w:hAnsi="Times New Roman"/>
+                <w:sz w:val="16"/>
+              </w:rPr>
+              <w:t>0.570</w:t>
+            </w:r>
+          </w:p>
+        </w:tc>
+      </w:tr>
+      <w:tr>
+        <w:tc>
+          <w:tcPr>
+            <w:tcW w:type="dxa" w:w="2160"/>
+          </w:tcPr>
+          <w:p>
+            <w:r/>
+            <w:r>
+              <w:rPr>
+                <w:rFonts w:ascii="Times New Roman" w:hAnsi="Times New Roman"/>
+                <w:sz w:val="16"/>
+              </w:rPr>
+              <w:t>external held-out (different seed)</w:t>
+            </w:r>
+          </w:p>
+        </w:tc>
+        <w:tc>
+          <w:tcPr>
+            <w:tcW w:type="dxa" w:w="1296"/>
+          </w:tcPr>
+          <w:p>
+            <w:r/>
+            <w:r>
+              <w:rPr>
+                <w:rFonts w:ascii="Times New Roman" w:hAnsi="Times New Roman"/>
+                <w:sz w:val="16"/>
+              </w:rPr>
+              <w:t>seed_20260713</w:t>
+            </w:r>
+          </w:p>
+        </w:tc>
+        <w:tc>
+          <w:tcPr>
+            <w:tcW w:type="dxa" w:w="1584"/>
+          </w:tcPr>
+          <w:p>
+            <w:r/>
+            <w:r>
+              <w:rPr>
+                <w:rFonts w:ascii="Times New Roman" w:hAnsi="Times New Roman"/>
+                <w:sz w:val="16"/>
+              </w:rPr>
+              <w:t>low_photosensitizer</w:t>
+            </w:r>
+          </w:p>
+        </w:tc>
+        <w:tc>
+          <w:tcPr>
+            <w:tcW w:type="dxa" w:w="576"/>
+          </w:tcPr>
+          <w:p>
+            <w:r/>
+            <w:r>
+              <w:rPr>
+                <w:rFonts w:ascii="Times New Roman" w:hAnsi="Times New Roman"/>
+                <w:sz w:val="16"/>
+              </w:rPr>
+              <w:t>960</w:t>
+            </w:r>
+          </w:p>
+        </w:tc>
+        <w:tc>
+          <w:tcPr>
+            <w:tcW w:type="dxa" w:w="864"/>
+          </w:tcPr>
+          <w:p>
+            <w:r/>
+            <w:r>
+              <w:rPr>
+                <w:rFonts w:ascii="Times New Roman" w:hAnsi="Times New Roman"/>
+                <w:sz w:val="16"/>
+              </w:rPr>
+              <w:t>0.630</w:t>
+            </w:r>
+          </w:p>
+        </w:tc>
+        <w:tc>
+          <w:tcPr>
+            <w:tcW w:type="dxa" w:w="1296"/>
+          </w:tcPr>
+          <w:p>
+            <w:r/>
+            <w:r>
+              <w:rPr>
+                <w:rFonts w:ascii="Times New Roman" w:hAnsi="Times New Roman"/>
+                <w:sz w:val="16"/>
+              </w:rPr>
+              <w:t>0.495</w:t>
+            </w:r>
+          </w:p>
+        </w:tc>
+        <w:tc>
+          <w:tcPr>
+            <w:tcW w:type="dxa" w:w="1296"/>
+          </w:tcPr>
+          <w:p>
+            <w:r/>
+            <w:r>
+              <w:rPr>
+                <w:rFonts w:ascii="Times New Roman" w:hAnsi="Times New Roman"/>
+                <w:sz w:val="16"/>
+              </w:rPr>
+              <w:t>0.357</w:t>
+            </w:r>
+          </w:p>
+        </w:tc>
+      </w:tr>
+      <w:tr>
+        <w:tc>
+          <w:tcPr>
+            <w:tcW w:type="dxa" w:w="2160"/>
+          </w:tcPr>
+          <w:p>
+            <w:r/>
+            <w:r>
+              <w:rPr>
+                <w:rFonts w:ascii="Times New Roman" w:hAnsi="Times New Roman"/>
+                <w:sz w:val="16"/>
+              </w:rPr>
+              <w:t>external held-out (different seed)</w:t>
+            </w:r>
+          </w:p>
+        </w:tc>
+        <w:tc>
+          <w:tcPr>
+            <w:tcW w:type="dxa" w:w="1296"/>
+          </w:tcPr>
+          <w:p>
+            <w:r/>
+            <w:r>
+              <w:rPr>
+                <w:rFonts w:ascii="Times New Roman" w:hAnsi="Times New Roman"/>
+                <w:sz w:val="16"/>
+              </w:rPr>
+              <w:t>seed_20260713</w:t>
+            </w:r>
+          </w:p>
+        </w:tc>
+        <w:tc>
+          <w:tcPr>
+            <w:tcW w:type="dxa" w:w="1584"/>
+          </w:tcPr>
+          <w:p>
+            <w:r/>
+            <w:r>
+              <w:rPr>
+                <w:rFonts w:ascii="Times New Roman" w:hAnsi="Times New Roman"/>
+                <w:sz w:val="16"/>
+              </w:rPr>
+              <w:t>slow_recovery</w:t>
+            </w:r>
+          </w:p>
+        </w:tc>
+        <w:tc>
+          <w:tcPr>
+            <w:tcW w:type="dxa" w:w="576"/>
+          </w:tcPr>
+          <w:p>
+            <w:r/>
+            <w:r>
+              <w:rPr>
+                <w:rFonts w:ascii="Times New Roman" w:hAnsi="Times New Roman"/>
+                <w:sz w:val="16"/>
+              </w:rPr>
+              <w:t>960</w:t>
+            </w:r>
+          </w:p>
+        </w:tc>
+        <w:tc>
+          <w:tcPr>
+            <w:tcW w:type="dxa" w:w="864"/>
+          </w:tcPr>
+          <w:p>
+            <w:r/>
+            <w:r>
+              <w:rPr>
+                <w:rFonts w:ascii="Times New Roman" w:hAnsi="Times New Roman"/>
+                <w:sz w:val="16"/>
+              </w:rPr>
+              <w:t>0.668</w:t>
+            </w:r>
+          </w:p>
+        </w:tc>
+        <w:tc>
+          <w:tcPr>
+            <w:tcW w:type="dxa" w:w="1296"/>
+          </w:tcPr>
+          <w:p>
+            <w:r/>
+            <w:r>
+              <w:rPr>
+                <w:rFonts w:ascii="Times New Roman" w:hAnsi="Times New Roman"/>
+                <w:sz w:val="16"/>
+              </w:rPr>
+              <w:t>0.463</w:t>
+            </w:r>
+          </w:p>
+        </w:tc>
+        <w:tc>
+          <w:tcPr>
+            <w:tcW w:type="dxa" w:w="1296"/>
+          </w:tcPr>
+          <w:p>
+            <w:r/>
+            <w:r>
+              <w:rPr>
+                <w:rFonts w:ascii="Times New Roman" w:hAnsi="Times New Roman"/>
+                <w:sz w:val="16"/>
+              </w:rPr>
+              <w:t>0.543</w:t>
+            </w:r>
+          </w:p>
+        </w:tc>
+      </w:tr>
+      <w:tr>
+        <w:tc>
+          <w:tcPr>
+            <w:tcW w:type="dxa" w:w="2160"/>
+          </w:tcPr>
+          <w:p>
+            <w:r/>
+            <w:r>
+              <w:rPr>
+                <w:rFonts w:ascii="Times New Roman" w:hAnsi="Times New Roman"/>
+                <w:sz w:val="16"/>
+              </w:rPr>
+              <w:t>external held-out (different seed)</w:t>
+            </w:r>
+          </w:p>
+        </w:tc>
+        <w:tc>
+          <w:tcPr>
+            <w:tcW w:type="dxa" w:w="1296"/>
+          </w:tcPr>
+          <w:p>
+            <w:r/>
+            <w:r>
+              <w:rPr>
+                <w:rFonts w:ascii="Times New Roman" w:hAnsi="Times New Roman"/>
+                <w:sz w:val="16"/>
+              </w:rPr>
+              <w:t>seed_20260713</w:t>
+            </w:r>
+          </w:p>
+        </w:tc>
+        <w:tc>
+          <w:tcPr>
+            <w:tcW w:type="dxa" w:w="1584"/>
+          </w:tcPr>
+          <w:p>
+            <w:r/>
+            <w:r>
+              <w:rPr>
+                <w:rFonts w:ascii="Times New Roman" w:hAnsi="Times New Roman"/>
+                <w:sz w:val="16"/>
+              </w:rPr>
+              <w:t>all</w:t>
+            </w:r>
+          </w:p>
+        </w:tc>
+        <w:tc>
+          <w:tcPr>
+            <w:tcW w:type="dxa" w:w="576"/>
+          </w:tcPr>
+          <w:p>
+            <w:r/>
+            <w:r>
+              <w:rPr>
+                <w:rFonts w:ascii="Times New Roman" w:hAnsi="Times New Roman"/>
+                <w:sz w:val="16"/>
+              </w:rPr>
+              <w:t>3840</w:t>
+            </w:r>
+          </w:p>
+        </w:tc>
+        <w:tc>
+          <w:tcPr>
+            <w:tcW w:type="dxa" w:w="864"/>
+          </w:tcPr>
+          <w:p>
+            <w:r/>
+            <w:r>
+              <w:rPr>
+                <w:rFonts w:ascii="Times New Roman" w:hAnsi="Times New Roman"/>
+                <w:sz w:val="16"/>
+              </w:rPr>
+              <w:t>0.610</w:t>
+            </w:r>
+          </w:p>
+        </w:tc>
+        <w:tc>
+          <w:tcPr>
+            <w:tcW w:type="dxa" w:w="1296"/>
+          </w:tcPr>
+          <w:p>
+            <w:r/>
+            <w:r>
+              <w:rPr>
+                <w:rFonts w:ascii="Times New Roman" w:hAnsi="Times New Roman"/>
+                <w:sz w:val="16"/>
+              </w:rPr>
+              <w:t>0.501</w:t>
+            </w:r>
+          </w:p>
+        </w:tc>
+        <w:tc>
+          <w:tcPr>
+            <w:tcW w:type="dxa" w:w="1296"/>
+          </w:tcPr>
+          <w:p>
+            <w:r/>
+            <w:r>
+              <w:rPr>
+                <w:rFonts w:ascii="Times New Roman" w:hAnsi="Times New Roman"/>
+                <w:sz w:val="16"/>
+              </w:rPr>
+              <w:t>0.492</w:t>
             </w:r>
           </w:p>
         </w:tc>
@@ -456,7 +1967,7 @@
           <w:i/>
           <w:sz w:val="18"/>
         </w:rPr>
-        <w:t>Endpoint definitions were frozen before any controller outcome was examined. warm_fraction is the fraction of the protocol window with 43 ≤ T ≤ 50 °C; overheat_fraction is the fraction with T &gt; 55 °C; ros_threshold_fraction is the fraction with ROS dose at or above the singlet-oxygen threshold; hypoxic_failure_fraction is the fraction with O2 &lt; 5 µM and ROS below threshold.</w:t>
+        <w:t>Discrimination of the frozen scoring rule. The locked validation rows are the analysis population; the external row is a fully held-out seed that was never used to fit or to tune the rule. Discrimination is modest, which is why strata are reported as predicted-baseline-success bands rather than as a validated controllability construct.</w:t>
       </w:r>
     </w:p>
     <w:sectPr>

</xml_diff>

<commit_message>
Release revised paired evaluation with corrected inference and manuscript
</commit_message>
<xml_diff>
--- a/peerj_analysis/tables/Supplemental Table S1.docx
+++ b/peerj_analysis/tables/Supplemental Table S1.docx
@@ -3,6 +3,10 @@
 <w:document xmlns:wpc="http://schemas.microsoft.com/office/word/2010/wordprocessingCanvas" xmlns:mo="http://schemas.microsoft.com/office/mac/office/2008/main" xmlns:mc="http://schemas.openxmlformats.org/markup-compatibility/2006" xmlns:mv="urn:schemas-microsoft-com:mac:vml" xmlns:o="urn:schemas-microsoft-com:office:office" xmlns:r="http://schemas.openxmlformats.org/officeDocument/2006/relationships" xmlns:m="http://schemas.openxmlformats.org/officeDocument/2006/math" xmlns:v="urn:schemas-microsoft-com:vml" xmlns:wp14="http://schemas.microsoft.com/office/word/2010/wordprocessingDrawing" xmlns:wp="http://schemas.openxmlformats.org/drawingml/2006/wordprocessingDrawing" xmlns:w10="urn:schemas-microsoft-com:office:word" xmlns:w="http://schemas.openxmlformats.org/wordprocessingml/2006/main" xmlns:w14="http://schemas.microsoft.com/office/word/2010/wordml" xmlns:wpg="http://schemas.microsoft.com/office/word/2010/wordprocessingGroup" xmlns:wpi="http://schemas.microsoft.com/office/word/2010/wordprocessingInk" xmlns:wne="http://schemas.microsoft.com/office/word/2006/wordml" xmlns:wps="http://schemas.microsoft.com/office/word/2010/wordprocessingShape" mc:Ignorable="w14 wp14">
   <w:body>
     <w:p>
+      <w:pPr>
+        <w:keepNext/>
+        <w:spacing w:line="240" w:lineRule="auto"/>
+      </w:pPr>
       <w:r>
         <w:rPr>
           <w:b/>
@@ -16,23 +20,36 @@
         <w:tblStyle w:val="TableGrid"/>
         <w:tblW w:type="auto" w:w="0"/>
         <w:jc w:val="center"/>
+        <w:tblLayout w:type="fixed"/>
         <w:tblLook w:firstColumn="1" w:firstRow="1" w:lastColumn="0" w:lastRow="0" w:noHBand="0" w:noVBand="1" w:val="04A0"/>
+        <w:tblBorders>
+          <w:top w:val="single" w:sz="4" w:color="D9D9D9"/>
+          <w:left w:val="single" w:sz="4" w:color="D9D9D9"/>
+          <w:bottom w:val="single" w:sz="4" w:color="D9D9D9"/>
+          <w:right w:val="single" w:sz="4" w:color="D9D9D9"/>
+          <w:insideH w:val="single" w:sz="4" w:color="D9D9D9"/>
+          <w:insideV w:val="single" w:sz="4" w:color="D9D9D9"/>
+        </w:tblBorders>
       </w:tblPr>
       <w:tblGrid>
+        <w:gridCol w:w="2229"/>
         <w:gridCol w:w="1337"/>
-        <w:gridCol w:w="1337"/>
-        <w:gridCol w:w="1337"/>
-        <w:gridCol w:w="1337"/>
-        <w:gridCol w:w="1337"/>
+        <w:gridCol w:w="1634"/>
+        <w:gridCol w:w="594"/>
+        <w:gridCol w:w="891"/>
         <w:gridCol w:w="1337"/>
         <w:gridCol w:w="1337"/>
       </w:tblGrid>
       <w:tr>
         <w:tc>
           <w:tcPr>
-            <w:tcW w:type="dxa" w:w="2160"/>
+            <w:tcW w:type="dxa" w:w="2229"/>
+            <w:shd w:fill="EAF1F8"/>
           </w:tcPr>
           <w:p>
+            <w:pPr>
+              <w:spacing w:after="40" w:before="40" w:line="240" w:lineRule="auto"/>
+            </w:pPr>
             <w:r/>
             <w:r>
               <w:rPr>
@@ -46,9 +63,13 @@
         </w:tc>
         <w:tc>
           <w:tcPr>
-            <w:tcW w:type="dxa" w:w="1296"/>
+            <w:tcW w:type="dxa" w:w="1337"/>
+            <w:shd w:fill="EAF1F8"/>
           </w:tcPr>
           <w:p>
+            <w:pPr>
+              <w:spacing w:after="40" w:before="40" w:line="240" w:lineRule="auto"/>
+            </w:pPr>
             <w:r/>
             <w:r>
               <w:rPr>
@@ -62,9 +83,13 @@
         </w:tc>
         <w:tc>
           <w:tcPr>
-            <w:tcW w:type="dxa" w:w="1584"/>
+            <w:tcW w:type="dxa" w:w="1634"/>
+            <w:shd w:fill="EAF1F8"/>
           </w:tcPr>
           <w:p>
+            <w:pPr>
+              <w:spacing w:after="40" w:before="40" w:line="240" w:lineRule="auto"/>
+            </w:pPr>
             <w:r/>
             <w:r>
               <w:rPr>
@@ -78,9 +103,13 @@
         </w:tc>
         <w:tc>
           <w:tcPr>
-            <w:tcW w:type="dxa" w:w="576"/>
+            <w:tcW w:type="dxa" w:w="594"/>
+            <w:shd w:fill="EAF1F8"/>
           </w:tcPr>
           <w:p>
+            <w:pPr>
+              <w:spacing w:after="40" w:before="40" w:line="240" w:lineRule="auto"/>
+            </w:pPr>
             <w:r/>
             <w:r>
               <w:rPr>
@@ -94,9 +123,13 @@
         </w:tc>
         <w:tc>
           <w:tcPr>
-            <w:tcW w:type="dxa" w:w="864"/>
+            <w:tcW w:type="dxa" w:w="891"/>
+            <w:shd w:fill="EAF1F8"/>
           </w:tcPr>
           <w:p>
+            <w:pPr>
+              <w:spacing w:after="40" w:before="40" w:line="240" w:lineRule="auto"/>
+            </w:pPr>
             <w:r/>
             <w:r>
               <w:rPr>
@@ -110,9 +143,13 @@
         </w:tc>
         <w:tc>
           <w:tcPr>
-            <w:tcW w:type="dxa" w:w="1296"/>
+            <w:tcW w:type="dxa" w:w="1337"/>
+            <w:shd w:fill="EAF1F8"/>
           </w:tcPr>
           <w:p>
+            <w:pPr>
+              <w:spacing w:after="40" w:before="40" w:line="240" w:lineRule="auto"/>
+            </w:pPr>
             <w:r/>
             <w:r>
               <w:rPr>
@@ -126,9 +163,13 @@
         </w:tc>
         <w:tc>
           <w:tcPr>
-            <w:tcW w:type="dxa" w:w="1296"/>
+            <w:tcW w:type="dxa" w:w="1337"/>
+            <w:shd w:fill="EAF1F8"/>
           </w:tcPr>
           <w:p>
+            <w:pPr>
+              <w:spacing w:after="40" w:before="40" w:line="240" w:lineRule="auto"/>
+            </w:pPr>
             <w:r/>
             <w:r>
               <w:rPr>
@@ -144,9 +185,12 @@
       <w:tr>
         <w:tc>
           <w:tcPr>
-            <w:tcW w:type="dxa" w:w="2160"/>
+            <w:tcW w:type="dxa" w:w="2229"/>
           </w:tcPr>
           <w:p>
+            <w:pPr>
+              <w:spacing w:after="40" w:before="40" w:line="240" w:lineRule="auto"/>
+            </w:pPr>
             <w:r/>
             <w:r>
               <w:rPr>
@@ -159,9 +203,12 @@
         </w:tc>
         <w:tc>
           <w:tcPr>
-            <w:tcW w:type="dxa" w:w="1296"/>
+            <w:tcW w:type="dxa" w:w="1337"/>
           </w:tcPr>
           <w:p>
+            <w:pPr>
+              <w:spacing w:after="40" w:before="40" w:line="240" w:lineRule="auto"/>
+            </w:pPr>
             <w:r/>
             <w:r>
               <w:rPr>
@@ -174,9 +221,12 @@
         </w:tc>
         <w:tc>
           <w:tcPr>
-            <w:tcW w:type="dxa" w:w="1584"/>
+            <w:tcW w:type="dxa" w:w="1634"/>
           </w:tcPr>
           <w:p>
+            <w:pPr>
+              <w:spacing w:after="40" w:before="40" w:line="240" w:lineRule="auto"/>
+            </w:pPr>
             <w:r/>
             <w:r>
               <w:rPr>
@@ -189,9 +239,12 @@
         </w:tc>
         <w:tc>
           <w:tcPr>
-            <w:tcW w:type="dxa" w:w="576"/>
+            <w:tcW w:type="dxa" w:w="594"/>
           </w:tcPr>
           <w:p>
+            <w:pPr>
+              <w:spacing w:after="40" w:before="40" w:line="240" w:lineRule="auto"/>
+            </w:pPr>
             <w:r/>
             <w:r>
               <w:rPr>
@@ -204,9 +257,12 @@
         </w:tc>
         <w:tc>
           <w:tcPr>
-            <w:tcW w:type="dxa" w:w="864"/>
+            <w:tcW w:type="dxa" w:w="891"/>
           </w:tcPr>
           <w:p>
+            <w:pPr>
+              <w:spacing w:after="40" w:before="40" w:line="240" w:lineRule="auto"/>
+            </w:pPr>
             <w:r/>
             <w:r>
               <w:rPr>
@@ -219,9 +275,12 @@
         </w:tc>
         <w:tc>
           <w:tcPr>
-            <w:tcW w:type="dxa" w:w="1296"/>
+            <w:tcW w:type="dxa" w:w="1337"/>
           </w:tcPr>
           <w:p>
+            <w:pPr>
+              <w:spacing w:after="40" w:before="40" w:line="240" w:lineRule="auto"/>
+            </w:pPr>
             <w:r/>
             <w:r>
               <w:rPr>
@@ -234,9 +293,12 @@
         </w:tc>
         <w:tc>
           <w:tcPr>
-            <w:tcW w:type="dxa" w:w="1296"/>
+            <w:tcW w:type="dxa" w:w="1337"/>
           </w:tcPr>
           <w:p>
+            <w:pPr>
+              <w:spacing w:after="40" w:before="40" w:line="240" w:lineRule="auto"/>
+            </w:pPr>
             <w:r/>
             <w:r>
               <w:rPr>
@@ -251,9 +313,12 @@
       <w:tr>
         <w:tc>
           <w:tcPr>
-            <w:tcW w:type="dxa" w:w="2160"/>
+            <w:tcW w:type="dxa" w:w="2229"/>
           </w:tcPr>
           <w:p>
+            <w:pPr>
+              <w:spacing w:after="40" w:before="40" w:line="240" w:lineRule="auto"/>
+            </w:pPr>
             <w:r/>
             <w:r>
               <w:rPr>
@@ -266,9 +331,12 @@
         </w:tc>
         <w:tc>
           <w:tcPr>
-            <w:tcW w:type="dxa" w:w="1296"/>
+            <w:tcW w:type="dxa" w:w="1337"/>
           </w:tcPr>
           <w:p>
+            <w:pPr>
+              <w:spacing w:after="40" w:before="40" w:line="240" w:lineRule="auto"/>
+            </w:pPr>
             <w:r/>
             <w:r>
               <w:rPr>
@@ -281,9 +349,12 @@
         </w:tc>
         <w:tc>
           <w:tcPr>
-            <w:tcW w:type="dxa" w:w="1584"/>
+            <w:tcW w:type="dxa" w:w="1634"/>
           </w:tcPr>
           <w:p>
+            <w:pPr>
+              <w:spacing w:after="40" w:before="40" w:line="240" w:lineRule="auto"/>
+            </w:pPr>
             <w:r/>
             <w:r>
               <w:rPr>
@@ -296,9 +367,12 @@
         </w:tc>
         <w:tc>
           <w:tcPr>
-            <w:tcW w:type="dxa" w:w="576"/>
+            <w:tcW w:type="dxa" w:w="594"/>
           </w:tcPr>
           <w:p>
+            <w:pPr>
+              <w:spacing w:after="40" w:before="40" w:line="240" w:lineRule="auto"/>
+            </w:pPr>
             <w:r/>
             <w:r>
               <w:rPr>
@@ -311,9 +385,12 @@
         </w:tc>
         <w:tc>
           <w:tcPr>
-            <w:tcW w:type="dxa" w:w="864"/>
+            <w:tcW w:type="dxa" w:w="891"/>
           </w:tcPr>
           <w:p>
+            <w:pPr>
+              <w:spacing w:after="40" w:before="40" w:line="240" w:lineRule="auto"/>
+            </w:pPr>
             <w:r/>
             <w:r>
               <w:rPr>
@@ -326,9 +403,12 @@
         </w:tc>
         <w:tc>
           <w:tcPr>
-            <w:tcW w:type="dxa" w:w="1296"/>
+            <w:tcW w:type="dxa" w:w="1337"/>
           </w:tcPr>
           <w:p>
+            <w:pPr>
+              <w:spacing w:after="40" w:before="40" w:line="240" w:lineRule="auto"/>
+            </w:pPr>
             <w:r/>
             <w:r>
               <w:rPr>
@@ -341,9 +421,12 @@
         </w:tc>
         <w:tc>
           <w:tcPr>
-            <w:tcW w:type="dxa" w:w="1296"/>
+            <w:tcW w:type="dxa" w:w="1337"/>
           </w:tcPr>
           <w:p>
+            <w:pPr>
+              <w:spacing w:after="40" w:before="40" w:line="240" w:lineRule="auto"/>
+            </w:pPr>
             <w:r/>
             <w:r>
               <w:rPr>
@@ -358,9 +441,12 @@
       <w:tr>
         <w:tc>
           <w:tcPr>
-            <w:tcW w:type="dxa" w:w="2160"/>
+            <w:tcW w:type="dxa" w:w="2229"/>
           </w:tcPr>
           <w:p>
+            <w:pPr>
+              <w:spacing w:after="40" w:before="40" w:line="240" w:lineRule="auto"/>
+            </w:pPr>
             <w:r/>
             <w:r>
               <w:rPr>
@@ -373,9 +459,12 @@
         </w:tc>
         <w:tc>
           <w:tcPr>
-            <w:tcW w:type="dxa" w:w="1296"/>
+            <w:tcW w:type="dxa" w:w="1337"/>
           </w:tcPr>
           <w:p>
+            <w:pPr>
+              <w:spacing w:after="40" w:before="40" w:line="240" w:lineRule="auto"/>
+            </w:pPr>
             <w:r/>
             <w:r>
               <w:rPr>
@@ -388,9 +477,12 @@
         </w:tc>
         <w:tc>
           <w:tcPr>
-            <w:tcW w:type="dxa" w:w="1584"/>
+            <w:tcW w:type="dxa" w:w="1634"/>
           </w:tcPr>
           <w:p>
+            <w:pPr>
+              <w:spacing w:after="40" w:before="40" w:line="240" w:lineRule="auto"/>
+            </w:pPr>
             <w:r/>
             <w:r>
               <w:rPr>
@@ -403,9 +495,12 @@
         </w:tc>
         <w:tc>
           <w:tcPr>
-            <w:tcW w:type="dxa" w:w="576"/>
+            <w:tcW w:type="dxa" w:w="594"/>
           </w:tcPr>
           <w:p>
+            <w:pPr>
+              <w:spacing w:after="40" w:before="40" w:line="240" w:lineRule="auto"/>
+            </w:pPr>
             <w:r/>
             <w:r>
               <w:rPr>
@@ -418,9 +513,12 @@
         </w:tc>
         <w:tc>
           <w:tcPr>
-            <w:tcW w:type="dxa" w:w="864"/>
+            <w:tcW w:type="dxa" w:w="891"/>
           </w:tcPr>
           <w:p>
+            <w:pPr>
+              <w:spacing w:after="40" w:before="40" w:line="240" w:lineRule="auto"/>
+            </w:pPr>
             <w:r/>
             <w:r>
               <w:rPr>
@@ -433,9 +531,12 @@
         </w:tc>
         <w:tc>
           <w:tcPr>
-            <w:tcW w:type="dxa" w:w="1296"/>
+            <w:tcW w:type="dxa" w:w="1337"/>
           </w:tcPr>
           <w:p>
+            <w:pPr>
+              <w:spacing w:after="40" w:before="40" w:line="240" w:lineRule="auto"/>
+            </w:pPr>
             <w:r/>
             <w:r>
               <w:rPr>
@@ -448,9 +549,12 @@
         </w:tc>
         <w:tc>
           <w:tcPr>
-            <w:tcW w:type="dxa" w:w="1296"/>
+            <w:tcW w:type="dxa" w:w="1337"/>
           </w:tcPr>
           <w:p>
+            <w:pPr>
+              <w:spacing w:after="40" w:before="40" w:line="240" w:lineRule="auto"/>
+            </w:pPr>
             <w:r/>
             <w:r>
               <w:rPr>
@@ -465,9 +569,12 @@
       <w:tr>
         <w:tc>
           <w:tcPr>
-            <w:tcW w:type="dxa" w:w="2160"/>
+            <w:tcW w:type="dxa" w:w="2229"/>
           </w:tcPr>
           <w:p>
+            <w:pPr>
+              <w:spacing w:after="40" w:before="40" w:line="240" w:lineRule="auto"/>
+            </w:pPr>
             <w:r/>
             <w:r>
               <w:rPr>
@@ -480,9 +587,12 @@
         </w:tc>
         <w:tc>
           <w:tcPr>
-            <w:tcW w:type="dxa" w:w="1296"/>
+            <w:tcW w:type="dxa" w:w="1337"/>
           </w:tcPr>
           <w:p>
+            <w:pPr>
+              <w:spacing w:after="40" w:before="40" w:line="240" w:lineRule="auto"/>
+            </w:pPr>
             <w:r/>
             <w:r>
               <w:rPr>
@@ -495,9 +605,12 @@
         </w:tc>
         <w:tc>
           <w:tcPr>
-            <w:tcW w:type="dxa" w:w="1584"/>
+            <w:tcW w:type="dxa" w:w="1634"/>
           </w:tcPr>
           <w:p>
+            <w:pPr>
+              <w:spacing w:after="40" w:before="40" w:line="240" w:lineRule="auto"/>
+            </w:pPr>
             <w:r/>
             <w:r>
               <w:rPr>
@@ -510,9 +623,12 @@
         </w:tc>
         <w:tc>
           <w:tcPr>
-            <w:tcW w:type="dxa" w:w="576"/>
+            <w:tcW w:type="dxa" w:w="594"/>
           </w:tcPr>
           <w:p>
+            <w:pPr>
+              <w:spacing w:after="40" w:before="40" w:line="240" w:lineRule="auto"/>
+            </w:pPr>
             <w:r/>
             <w:r>
               <w:rPr>
@@ -525,9 +641,12 @@
         </w:tc>
         <w:tc>
           <w:tcPr>
-            <w:tcW w:type="dxa" w:w="864"/>
+            <w:tcW w:type="dxa" w:w="891"/>
           </w:tcPr>
           <w:p>
+            <w:pPr>
+              <w:spacing w:after="40" w:before="40" w:line="240" w:lineRule="auto"/>
+            </w:pPr>
             <w:r/>
             <w:r>
               <w:rPr>
@@ -540,9 +659,12 @@
         </w:tc>
         <w:tc>
           <w:tcPr>
-            <w:tcW w:type="dxa" w:w="1296"/>
+            <w:tcW w:type="dxa" w:w="1337"/>
           </w:tcPr>
           <w:p>
+            <w:pPr>
+              <w:spacing w:after="40" w:before="40" w:line="240" w:lineRule="auto"/>
+            </w:pPr>
             <w:r/>
             <w:r>
               <w:rPr>
@@ -555,9 +677,12 @@
         </w:tc>
         <w:tc>
           <w:tcPr>
-            <w:tcW w:type="dxa" w:w="1296"/>
+            <w:tcW w:type="dxa" w:w="1337"/>
           </w:tcPr>
           <w:p>
+            <w:pPr>
+              <w:spacing w:after="40" w:before="40" w:line="240" w:lineRule="auto"/>
+            </w:pPr>
             <w:r/>
             <w:r>
               <w:rPr>
@@ -572,9 +697,12 @@
       <w:tr>
         <w:tc>
           <w:tcPr>
-            <w:tcW w:type="dxa" w:w="2160"/>
+            <w:tcW w:type="dxa" w:w="2229"/>
           </w:tcPr>
           <w:p>
+            <w:pPr>
+              <w:spacing w:after="40" w:before="40" w:line="240" w:lineRule="auto"/>
+            </w:pPr>
             <w:r/>
             <w:r>
               <w:rPr>
@@ -587,9 +715,12 @@
         </w:tc>
         <w:tc>
           <w:tcPr>
-            <w:tcW w:type="dxa" w:w="1296"/>
+            <w:tcW w:type="dxa" w:w="1337"/>
           </w:tcPr>
           <w:p>
+            <w:pPr>
+              <w:spacing w:after="40" w:before="40" w:line="240" w:lineRule="auto"/>
+            </w:pPr>
             <w:r/>
             <w:r>
               <w:rPr>
@@ -602,9 +733,12 @@
         </w:tc>
         <w:tc>
           <w:tcPr>
-            <w:tcW w:type="dxa" w:w="1584"/>
+            <w:tcW w:type="dxa" w:w="1634"/>
           </w:tcPr>
           <w:p>
+            <w:pPr>
+              <w:spacing w:after="40" w:before="40" w:line="240" w:lineRule="auto"/>
+            </w:pPr>
             <w:r/>
             <w:r>
               <w:rPr>
@@ -617,9 +751,12 @@
         </w:tc>
         <w:tc>
           <w:tcPr>
-            <w:tcW w:type="dxa" w:w="576"/>
+            <w:tcW w:type="dxa" w:w="594"/>
           </w:tcPr>
           <w:p>
+            <w:pPr>
+              <w:spacing w:after="40" w:before="40" w:line="240" w:lineRule="auto"/>
+            </w:pPr>
             <w:r/>
             <w:r>
               <w:rPr>
@@ -632,9 +769,12 @@
         </w:tc>
         <w:tc>
           <w:tcPr>
-            <w:tcW w:type="dxa" w:w="864"/>
+            <w:tcW w:type="dxa" w:w="891"/>
           </w:tcPr>
           <w:p>
+            <w:pPr>
+              <w:spacing w:after="40" w:before="40" w:line="240" w:lineRule="auto"/>
+            </w:pPr>
             <w:r/>
             <w:r>
               <w:rPr>
@@ -647,9 +787,12 @@
         </w:tc>
         <w:tc>
           <w:tcPr>
-            <w:tcW w:type="dxa" w:w="1296"/>
+            <w:tcW w:type="dxa" w:w="1337"/>
           </w:tcPr>
           <w:p>
+            <w:pPr>
+              <w:spacing w:after="40" w:before="40" w:line="240" w:lineRule="auto"/>
+            </w:pPr>
             <w:r/>
             <w:r>
               <w:rPr>
@@ -662,9 +805,12 @@
         </w:tc>
         <w:tc>
           <w:tcPr>
-            <w:tcW w:type="dxa" w:w="1296"/>
+            <w:tcW w:type="dxa" w:w="1337"/>
           </w:tcPr>
           <w:p>
+            <w:pPr>
+              <w:spacing w:after="40" w:before="40" w:line="240" w:lineRule="auto"/>
+            </w:pPr>
             <w:r/>
             <w:r>
               <w:rPr>
@@ -679,9 +825,12 @@
       <w:tr>
         <w:tc>
           <w:tcPr>
-            <w:tcW w:type="dxa" w:w="2160"/>
+            <w:tcW w:type="dxa" w:w="2229"/>
           </w:tcPr>
           <w:p>
+            <w:pPr>
+              <w:spacing w:after="40" w:before="40" w:line="240" w:lineRule="auto"/>
+            </w:pPr>
             <w:r/>
             <w:r>
               <w:rPr>
@@ -694,9 +843,12 @@
         </w:tc>
         <w:tc>
           <w:tcPr>
-            <w:tcW w:type="dxa" w:w="1296"/>
+            <w:tcW w:type="dxa" w:w="1337"/>
           </w:tcPr>
           <w:p>
+            <w:pPr>
+              <w:spacing w:after="40" w:before="40" w:line="240" w:lineRule="auto"/>
+            </w:pPr>
             <w:r/>
             <w:r>
               <w:rPr>
@@ -709,9 +861,12 @@
         </w:tc>
         <w:tc>
           <w:tcPr>
-            <w:tcW w:type="dxa" w:w="1584"/>
+            <w:tcW w:type="dxa" w:w="1634"/>
           </w:tcPr>
           <w:p>
+            <w:pPr>
+              <w:spacing w:after="40" w:before="40" w:line="240" w:lineRule="auto"/>
+            </w:pPr>
             <w:r/>
             <w:r>
               <w:rPr>
@@ -724,9 +879,12 @@
         </w:tc>
         <w:tc>
           <w:tcPr>
-            <w:tcW w:type="dxa" w:w="576"/>
+            <w:tcW w:type="dxa" w:w="594"/>
           </w:tcPr>
           <w:p>
+            <w:pPr>
+              <w:spacing w:after="40" w:before="40" w:line="240" w:lineRule="auto"/>
+            </w:pPr>
             <w:r/>
             <w:r>
               <w:rPr>
@@ -739,9 +897,12 @@
         </w:tc>
         <w:tc>
           <w:tcPr>
-            <w:tcW w:type="dxa" w:w="864"/>
+            <w:tcW w:type="dxa" w:w="891"/>
           </w:tcPr>
           <w:p>
+            <w:pPr>
+              <w:spacing w:after="40" w:before="40" w:line="240" w:lineRule="auto"/>
+            </w:pPr>
             <w:r/>
             <w:r>
               <w:rPr>
@@ -754,9 +915,12 @@
         </w:tc>
         <w:tc>
           <w:tcPr>
-            <w:tcW w:type="dxa" w:w="1296"/>
+            <w:tcW w:type="dxa" w:w="1337"/>
           </w:tcPr>
           <w:p>
+            <w:pPr>
+              <w:spacing w:after="40" w:before="40" w:line="240" w:lineRule="auto"/>
+            </w:pPr>
             <w:r/>
             <w:r>
               <w:rPr>
@@ -769,9 +933,12 @@
         </w:tc>
         <w:tc>
           <w:tcPr>
-            <w:tcW w:type="dxa" w:w="1296"/>
+            <w:tcW w:type="dxa" w:w="1337"/>
           </w:tcPr>
           <w:p>
+            <w:pPr>
+              <w:spacing w:after="40" w:before="40" w:line="240" w:lineRule="auto"/>
+            </w:pPr>
             <w:r/>
             <w:r>
               <w:rPr>
@@ -786,9 +953,12 @@
       <w:tr>
         <w:tc>
           <w:tcPr>
-            <w:tcW w:type="dxa" w:w="2160"/>
+            <w:tcW w:type="dxa" w:w="2229"/>
           </w:tcPr>
           <w:p>
+            <w:pPr>
+              <w:spacing w:after="40" w:before="40" w:line="240" w:lineRule="auto"/>
+            </w:pPr>
             <w:r/>
             <w:r>
               <w:rPr>
@@ -801,9 +971,12 @@
         </w:tc>
         <w:tc>
           <w:tcPr>
-            <w:tcW w:type="dxa" w:w="1296"/>
+            <w:tcW w:type="dxa" w:w="1337"/>
           </w:tcPr>
           <w:p>
+            <w:pPr>
+              <w:spacing w:after="40" w:before="40" w:line="240" w:lineRule="auto"/>
+            </w:pPr>
             <w:r/>
             <w:r>
               <w:rPr>
@@ -816,9 +989,12 @@
         </w:tc>
         <w:tc>
           <w:tcPr>
-            <w:tcW w:type="dxa" w:w="1584"/>
+            <w:tcW w:type="dxa" w:w="1634"/>
           </w:tcPr>
           <w:p>
+            <w:pPr>
+              <w:spacing w:after="40" w:before="40" w:line="240" w:lineRule="auto"/>
+            </w:pPr>
             <w:r/>
             <w:r>
               <w:rPr>
@@ -831,9 +1007,12 @@
         </w:tc>
         <w:tc>
           <w:tcPr>
-            <w:tcW w:type="dxa" w:w="576"/>
+            <w:tcW w:type="dxa" w:w="594"/>
           </w:tcPr>
           <w:p>
+            <w:pPr>
+              <w:spacing w:after="40" w:before="40" w:line="240" w:lineRule="auto"/>
+            </w:pPr>
             <w:r/>
             <w:r>
               <w:rPr>
@@ -846,9 +1025,12 @@
         </w:tc>
         <w:tc>
           <w:tcPr>
-            <w:tcW w:type="dxa" w:w="864"/>
+            <w:tcW w:type="dxa" w:w="891"/>
           </w:tcPr>
           <w:p>
+            <w:pPr>
+              <w:spacing w:after="40" w:before="40" w:line="240" w:lineRule="auto"/>
+            </w:pPr>
             <w:r/>
             <w:r>
               <w:rPr>
@@ -861,9 +1043,12 @@
         </w:tc>
         <w:tc>
           <w:tcPr>
-            <w:tcW w:type="dxa" w:w="1296"/>
+            <w:tcW w:type="dxa" w:w="1337"/>
           </w:tcPr>
           <w:p>
+            <w:pPr>
+              <w:spacing w:after="40" w:before="40" w:line="240" w:lineRule="auto"/>
+            </w:pPr>
             <w:r/>
             <w:r>
               <w:rPr>
@@ -876,9 +1061,12 @@
         </w:tc>
         <w:tc>
           <w:tcPr>
-            <w:tcW w:type="dxa" w:w="1296"/>
+            <w:tcW w:type="dxa" w:w="1337"/>
           </w:tcPr>
           <w:p>
+            <w:pPr>
+              <w:spacing w:after="40" w:before="40" w:line="240" w:lineRule="auto"/>
+            </w:pPr>
             <w:r/>
             <w:r>
               <w:rPr>
@@ -893,9 +1081,12 @@
       <w:tr>
         <w:tc>
           <w:tcPr>
-            <w:tcW w:type="dxa" w:w="2160"/>
+            <w:tcW w:type="dxa" w:w="2229"/>
           </w:tcPr>
           <w:p>
+            <w:pPr>
+              <w:spacing w:after="40" w:before="40" w:line="240" w:lineRule="auto"/>
+            </w:pPr>
             <w:r/>
             <w:r>
               <w:rPr>
@@ -908,9 +1099,12 @@
         </w:tc>
         <w:tc>
           <w:tcPr>
-            <w:tcW w:type="dxa" w:w="1296"/>
+            <w:tcW w:type="dxa" w:w="1337"/>
           </w:tcPr>
           <w:p>
+            <w:pPr>
+              <w:spacing w:after="40" w:before="40" w:line="240" w:lineRule="auto"/>
+            </w:pPr>
             <w:r/>
             <w:r>
               <w:rPr>
@@ -923,9 +1117,12 @@
         </w:tc>
         <w:tc>
           <w:tcPr>
-            <w:tcW w:type="dxa" w:w="1584"/>
+            <w:tcW w:type="dxa" w:w="1634"/>
           </w:tcPr>
           <w:p>
+            <w:pPr>
+              <w:spacing w:after="40" w:before="40" w:line="240" w:lineRule="auto"/>
+            </w:pPr>
             <w:r/>
             <w:r>
               <w:rPr>
@@ -938,9 +1135,12 @@
         </w:tc>
         <w:tc>
           <w:tcPr>
-            <w:tcW w:type="dxa" w:w="576"/>
+            <w:tcW w:type="dxa" w:w="594"/>
           </w:tcPr>
           <w:p>
+            <w:pPr>
+              <w:spacing w:after="40" w:before="40" w:line="240" w:lineRule="auto"/>
+            </w:pPr>
             <w:r/>
             <w:r>
               <w:rPr>
@@ -953,9 +1153,12 @@
         </w:tc>
         <w:tc>
           <w:tcPr>
-            <w:tcW w:type="dxa" w:w="864"/>
+            <w:tcW w:type="dxa" w:w="891"/>
           </w:tcPr>
           <w:p>
+            <w:pPr>
+              <w:spacing w:after="40" w:before="40" w:line="240" w:lineRule="auto"/>
+            </w:pPr>
             <w:r/>
             <w:r>
               <w:rPr>
@@ -968,9 +1171,12 @@
         </w:tc>
         <w:tc>
           <w:tcPr>
-            <w:tcW w:type="dxa" w:w="1296"/>
+            <w:tcW w:type="dxa" w:w="1337"/>
           </w:tcPr>
           <w:p>
+            <w:pPr>
+              <w:spacing w:after="40" w:before="40" w:line="240" w:lineRule="auto"/>
+            </w:pPr>
             <w:r/>
             <w:r>
               <w:rPr>
@@ -983,9 +1189,12 @@
         </w:tc>
         <w:tc>
           <w:tcPr>
-            <w:tcW w:type="dxa" w:w="1296"/>
+            <w:tcW w:type="dxa" w:w="1337"/>
           </w:tcPr>
           <w:p>
+            <w:pPr>
+              <w:spacing w:after="40" w:before="40" w:line="240" w:lineRule="auto"/>
+            </w:pPr>
             <w:r/>
             <w:r>
               <w:rPr>
@@ -1000,9 +1209,12 @@
       <w:tr>
         <w:tc>
           <w:tcPr>
-            <w:tcW w:type="dxa" w:w="2160"/>
+            <w:tcW w:type="dxa" w:w="2229"/>
           </w:tcPr>
           <w:p>
+            <w:pPr>
+              <w:spacing w:after="40" w:before="40" w:line="240" w:lineRule="auto"/>
+            </w:pPr>
             <w:r/>
             <w:r>
               <w:rPr>
@@ -1015,9 +1227,12 @@
         </w:tc>
         <w:tc>
           <w:tcPr>
-            <w:tcW w:type="dxa" w:w="1296"/>
+            <w:tcW w:type="dxa" w:w="1337"/>
           </w:tcPr>
           <w:p>
+            <w:pPr>
+              <w:spacing w:after="40" w:before="40" w:line="240" w:lineRule="auto"/>
+            </w:pPr>
             <w:r/>
             <w:r>
               <w:rPr>
@@ -1030,9 +1245,12 @@
         </w:tc>
         <w:tc>
           <w:tcPr>
-            <w:tcW w:type="dxa" w:w="1584"/>
+            <w:tcW w:type="dxa" w:w="1634"/>
           </w:tcPr>
           <w:p>
+            <w:pPr>
+              <w:spacing w:after="40" w:before="40" w:line="240" w:lineRule="auto"/>
+            </w:pPr>
             <w:r/>
             <w:r>
               <w:rPr>
@@ -1045,9 +1263,12 @@
         </w:tc>
         <w:tc>
           <w:tcPr>
-            <w:tcW w:type="dxa" w:w="576"/>
+            <w:tcW w:type="dxa" w:w="594"/>
           </w:tcPr>
           <w:p>
+            <w:pPr>
+              <w:spacing w:after="40" w:before="40" w:line="240" w:lineRule="auto"/>
+            </w:pPr>
             <w:r/>
             <w:r>
               <w:rPr>
@@ -1060,9 +1281,12 @@
         </w:tc>
         <w:tc>
           <w:tcPr>
-            <w:tcW w:type="dxa" w:w="864"/>
+            <w:tcW w:type="dxa" w:w="891"/>
           </w:tcPr>
           <w:p>
+            <w:pPr>
+              <w:spacing w:after="40" w:before="40" w:line="240" w:lineRule="auto"/>
+            </w:pPr>
             <w:r/>
             <w:r>
               <w:rPr>
@@ -1075,9 +1299,12 @@
         </w:tc>
         <w:tc>
           <w:tcPr>
-            <w:tcW w:type="dxa" w:w="1296"/>
+            <w:tcW w:type="dxa" w:w="1337"/>
           </w:tcPr>
           <w:p>
+            <w:pPr>
+              <w:spacing w:after="40" w:before="40" w:line="240" w:lineRule="auto"/>
+            </w:pPr>
             <w:r/>
             <w:r>
               <w:rPr>
@@ -1090,9 +1317,12 @@
         </w:tc>
         <w:tc>
           <w:tcPr>
-            <w:tcW w:type="dxa" w:w="1296"/>
+            <w:tcW w:type="dxa" w:w="1337"/>
           </w:tcPr>
           <w:p>
+            <w:pPr>
+              <w:spacing w:after="40" w:before="40" w:line="240" w:lineRule="auto"/>
+            </w:pPr>
             <w:r/>
             <w:r>
               <w:rPr>
@@ -1107,9 +1337,12 @@
       <w:tr>
         <w:tc>
           <w:tcPr>
-            <w:tcW w:type="dxa" w:w="2160"/>
+            <w:tcW w:type="dxa" w:w="2229"/>
           </w:tcPr>
           <w:p>
+            <w:pPr>
+              <w:spacing w:after="40" w:before="40" w:line="240" w:lineRule="auto"/>
+            </w:pPr>
             <w:r/>
             <w:r>
               <w:rPr>
@@ -1122,9 +1355,12 @@
         </w:tc>
         <w:tc>
           <w:tcPr>
-            <w:tcW w:type="dxa" w:w="1296"/>
+            <w:tcW w:type="dxa" w:w="1337"/>
           </w:tcPr>
           <w:p>
+            <w:pPr>
+              <w:spacing w:after="40" w:before="40" w:line="240" w:lineRule="auto"/>
+            </w:pPr>
             <w:r/>
             <w:r>
               <w:rPr>
@@ -1137,9 +1373,12 @@
         </w:tc>
         <w:tc>
           <w:tcPr>
-            <w:tcW w:type="dxa" w:w="1584"/>
+            <w:tcW w:type="dxa" w:w="1634"/>
           </w:tcPr>
           <w:p>
+            <w:pPr>
+              <w:spacing w:after="40" w:before="40" w:line="240" w:lineRule="auto"/>
+            </w:pPr>
             <w:r/>
             <w:r>
               <w:rPr>
@@ -1152,9 +1391,12 @@
         </w:tc>
         <w:tc>
           <w:tcPr>
-            <w:tcW w:type="dxa" w:w="576"/>
+            <w:tcW w:type="dxa" w:w="594"/>
           </w:tcPr>
           <w:p>
+            <w:pPr>
+              <w:spacing w:after="40" w:before="40" w:line="240" w:lineRule="auto"/>
+            </w:pPr>
             <w:r/>
             <w:r>
               <w:rPr>
@@ -1167,9 +1409,12 @@
         </w:tc>
         <w:tc>
           <w:tcPr>
-            <w:tcW w:type="dxa" w:w="864"/>
+            <w:tcW w:type="dxa" w:w="891"/>
           </w:tcPr>
           <w:p>
+            <w:pPr>
+              <w:spacing w:after="40" w:before="40" w:line="240" w:lineRule="auto"/>
+            </w:pPr>
             <w:r/>
             <w:r>
               <w:rPr>
@@ -1182,9 +1427,12 @@
         </w:tc>
         <w:tc>
           <w:tcPr>
-            <w:tcW w:type="dxa" w:w="1296"/>
+            <w:tcW w:type="dxa" w:w="1337"/>
           </w:tcPr>
           <w:p>
+            <w:pPr>
+              <w:spacing w:after="40" w:before="40" w:line="240" w:lineRule="auto"/>
+            </w:pPr>
             <w:r/>
             <w:r>
               <w:rPr>
@@ -1197,9 +1445,12 @@
         </w:tc>
         <w:tc>
           <w:tcPr>
-            <w:tcW w:type="dxa" w:w="1296"/>
+            <w:tcW w:type="dxa" w:w="1337"/>
           </w:tcPr>
           <w:p>
+            <w:pPr>
+              <w:spacing w:after="40" w:before="40" w:line="240" w:lineRule="auto"/>
+            </w:pPr>
             <w:r/>
             <w:r>
               <w:rPr>
@@ -1214,9 +1465,12 @@
       <w:tr>
         <w:tc>
           <w:tcPr>
-            <w:tcW w:type="dxa" w:w="2160"/>
+            <w:tcW w:type="dxa" w:w="2229"/>
           </w:tcPr>
           <w:p>
+            <w:pPr>
+              <w:spacing w:after="40" w:before="40" w:line="240" w:lineRule="auto"/>
+            </w:pPr>
             <w:r/>
             <w:r>
               <w:rPr>
@@ -1229,9 +1483,12 @@
         </w:tc>
         <w:tc>
           <w:tcPr>
-            <w:tcW w:type="dxa" w:w="1296"/>
+            <w:tcW w:type="dxa" w:w="1337"/>
           </w:tcPr>
           <w:p>
+            <w:pPr>
+              <w:spacing w:after="40" w:before="40" w:line="240" w:lineRule="auto"/>
+            </w:pPr>
             <w:r/>
             <w:r>
               <w:rPr>
@@ -1244,9 +1501,12 @@
         </w:tc>
         <w:tc>
           <w:tcPr>
-            <w:tcW w:type="dxa" w:w="1584"/>
+            <w:tcW w:type="dxa" w:w="1634"/>
           </w:tcPr>
           <w:p>
+            <w:pPr>
+              <w:spacing w:after="40" w:before="40" w:line="240" w:lineRule="auto"/>
+            </w:pPr>
             <w:r/>
             <w:r>
               <w:rPr>
@@ -1259,9 +1519,12 @@
         </w:tc>
         <w:tc>
           <w:tcPr>
-            <w:tcW w:type="dxa" w:w="576"/>
+            <w:tcW w:type="dxa" w:w="594"/>
           </w:tcPr>
           <w:p>
+            <w:pPr>
+              <w:spacing w:after="40" w:before="40" w:line="240" w:lineRule="auto"/>
+            </w:pPr>
             <w:r/>
             <w:r>
               <w:rPr>
@@ -1274,9 +1537,12 @@
         </w:tc>
         <w:tc>
           <w:tcPr>
-            <w:tcW w:type="dxa" w:w="864"/>
+            <w:tcW w:type="dxa" w:w="891"/>
           </w:tcPr>
           <w:p>
+            <w:pPr>
+              <w:spacing w:after="40" w:before="40" w:line="240" w:lineRule="auto"/>
+            </w:pPr>
             <w:r/>
             <w:r>
               <w:rPr>
@@ -1289,9 +1555,12 @@
         </w:tc>
         <w:tc>
           <w:tcPr>
-            <w:tcW w:type="dxa" w:w="1296"/>
+            <w:tcW w:type="dxa" w:w="1337"/>
           </w:tcPr>
           <w:p>
+            <w:pPr>
+              <w:spacing w:after="40" w:before="40" w:line="240" w:lineRule="auto"/>
+            </w:pPr>
             <w:r/>
             <w:r>
               <w:rPr>
@@ -1304,9 +1573,12 @@
         </w:tc>
         <w:tc>
           <w:tcPr>
-            <w:tcW w:type="dxa" w:w="1296"/>
+            <w:tcW w:type="dxa" w:w="1337"/>
           </w:tcPr>
           <w:p>
+            <w:pPr>
+              <w:spacing w:after="40" w:before="40" w:line="240" w:lineRule="auto"/>
+            </w:pPr>
             <w:r/>
             <w:r>
               <w:rPr>
@@ -1321,9 +1593,12 @@
       <w:tr>
         <w:tc>
           <w:tcPr>
-            <w:tcW w:type="dxa" w:w="2160"/>
+            <w:tcW w:type="dxa" w:w="2229"/>
           </w:tcPr>
           <w:p>
+            <w:pPr>
+              <w:spacing w:after="40" w:before="40" w:line="240" w:lineRule="auto"/>
+            </w:pPr>
             <w:r/>
             <w:r>
               <w:rPr>
@@ -1336,9 +1611,12 @@
         </w:tc>
         <w:tc>
           <w:tcPr>
-            <w:tcW w:type="dxa" w:w="1296"/>
+            <w:tcW w:type="dxa" w:w="1337"/>
           </w:tcPr>
           <w:p>
+            <w:pPr>
+              <w:spacing w:after="40" w:before="40" w:line="240" w:lineRule="auto"/>
+            </w:pPr>
             <w:r/>
             <w:r>
               <w:rPr>
@@ -1351,9 +1629,12 @@
         </w:tc>
         <w:tc>
           <w:tcPr>
-            <w:tcW w:type="dxa" w:w="1584"/>
+            <w:tcW w:type="dxa" w:w="1634"/>
           </w:tcPr>
           <w:p>
+            <w:pPr>
+              <w:spacing w:after="40" w:before="40" w:line="240" w:lineRule="auto"/>
+            </w:pPr>
             <w:r/>
             <w:r>
               <w:rPr>
@@ -1366,9 +1647,12 @@
         </w:tc>
         <w:tc>
           <w:tcPr>
-            <w:tcW w:type="dxa" w:w="576"/>
+            <w:tcW w:type="dxa" w:w="594"/>
           </w:tcPr>
           <w:p>
+            <w:pPr>
+              <w:spacing w:after="40" w:before="40" w:line="240" w:lineRule="auto"/>
+            </w:pPr>
             <w:r/>
             <w:r>
               <w:rPr>
@@ -1381,9 +1665,12 @@
         </w:tc>
         <w:tc>
           <w:tcPr>
-            <w:tcW w:type="dxa" w:w="864"/>
+            <w:tcW w:type="dxa" w:w="891"/>
           </w:tcPr>
           <w:p>
+            <w:pPr>
+              <w:spacing w:after="40" w:before="40" w:line="240" w:lineRule="auto"/>
+            </w:pPr>
             <w:r/>
             <w:r>
               <w:rPr>
@@ -1396,9 +1683,12 @@
         </w:tc>
         <w:tc>
           <w:tcPr>
-            <w:tcW w:type="dxa" w:w="1296"/>
+            <w:tcW w:type="dxa" w:w="1337"/>
           </w:tcPr>
           <w:p>
+            <w:pPr>
+              <w:spacing w:after="40" w:before="40" w:line="240" w:lineRule="auto"/>
+            </w:pPr>
             <w:r/>
             <w:r>
               <w:rPr>
@@ -1411,9 +1701,12 @@
         </w:tc>
         <w:tc>
           <w:tcPr>
-            <w:tcW w:type="dxa" w:w="1296"/>
+            <w:tcW w:type="dxa" w:w="1337"/>
           </w:tcPr>
           <w:p>
+            <w:pPr>
+              <w:spacing w:after="40" w:before="40" w:line="240" w:lineRule="auto"/>
+            </w:pPr>
             <w:r/>
             <w:r>
               <w:rPr>
@@ -1428,9 +1721,12 @@
       <w:tr>
         <w:tc>
           <w:tcPr>
-            <w:tcW w:type="dxa" w:w="2160"/>
+            <w:tcW w:type="dxa" w:w="2229"/>
           </w:tcPr>
           <w:p>
+            <w:pPr>
+              <w:spacing w:after="40" w:before="40" w:line="240" w:lineRule="auto"/>
+            </w:pPr>
             <w:r/>
             <w:r>
               <w:rPr>
@@ -1443,9 +1739,12 @@
         </w:tc>
         <w:tc>
           <w:tcPr>
-            <w:tcW w:type="dxa" w:w="1296"/>
+            <w:tcW w:type="dxa" w:w="1337"/>
           </w:tcPr>
           <w:p>
+            <w:pPr>
+              <w:spacing w:after="40" w:before="40" w:line="240" w:lineRule="auto"/>
+            </w:pPr>
             <w:r/>
             <w:r>
               <w:rPr>
@@ -1458,9 +1757,12 @@
         </w:tc>
         <w:tc>
           <w:tcPr>
-            <w:tcW w:type="dxa" w:w="1584"/>
+            <w:tcW w:type="dxa" w:w="1634"/>
           </w:tcPr>
           <w:p>
+            <w:pPr>
+              <w:spacing w:after="40" w:before="40" w:line="240" w:lineRule="auto"/>
+            </w:pPr>
             <w:r/>
             <w:r>
               <w:rPr>
@@ -1473,9 +1775,12 @@
         </w:tc>
         <w:tc>
           <w:tcPr>
-            <w:tcW w:type="dxa" w:w="576"/>
+            <w:tcW w:type="dxa" w:w="594"/>
           </w:tcPr>
           <w:p>
+            <w:pPr>
+              <w:spacing w:after="40" w:before="40" w:line="240" w:lineRule="auto"/>
+            </w:pPr>
             <w:r/>
             <w:r>
               <w:rPr>
@@ -1488,9 +1793,12 @@
         </w:tc>
         <w:tc>
           <w:tcPr>
-            <w:tcW w:type="dxa" w:w="864"/>
+            <w:tcW w:type="dxa" w:w="891"/>
           </w:tcPr>
           <w:p>
+            <w:pPr>
+              <w:spacing w:after="40" w:before="40" w:line="240" w:lineRule="auto"/>
+            </w:pPr>
             <w:r/>
             <w:r>
               <w:rPr>
@@ -1503,9 +1811,12 @@
         </w:tc>
         <w:tc>
           <w:tcPr>
-            <w:tcW w:type="dxa" w:w="1296"/>
+            <w:tcW w:type="dxa" w:w="1337"/>
           </w:tcPr>
           <w:p>
+            <w:pPr>
+              <w:spacing w:after="40" w:before="40" w:line="240" w:lineRule="auto"/>
+            </w:pPr>
             <w:r/>
             <w:r>
               <w:rPr>
@@ -1518,9 +1829,12 @@
         </w:tc>
         <w:tc>
           <w:tcPr>
-            <w:tcW w:type="dxa" w:w="1296"/>
+            <w:tcW w:type="dxa" w:w="1337"/>
           </w:tcPr>
           <w:p>
+            <w:pPr>
+              <w:spacing w:after="40" w:before="40" w:line="240" w:lineRule="auto"/>
+            </w:pPr>
             <w:r/>
             <w:r>
               <w:rPr>
@@ -1535,9 +1849,12 @@
       <w:tr>
         <w:tc>
           <w:tcPr>
-            <w:tcW w:type="dxa" w:w="2160"/>
+            <w:tcW w:type="dxa" w:w="2229"/>
           </w:tcPr>
           <w:p>
+            <w:pPr>
+              <w:spacing w:after="40" w:before="40" w:line="240" w:lineRule="auto"/>
+            </w:pPr>
             <w:r/>
             <w:r>
               <w:rPr>
@@ -1550,9 +1867,12 @@
         </w:tc>
         <w:tc>
           <w:tcPr>
-            <w:tcW w:type="dxa" w:w="1296"/>
+            <w:tcW w:type="dxa" w:w="1337"/>
           </w:tcPr>
           <w:p>
+            <w:pPr>
+              <w:spacing w:after="40" w:before="40" w:line="240" w:lineRule="auto"/>
+            </w:pPr>
             <w:r/>
             <w:r>
               <w:rPr>
@@ -1565,9 +1885,12 @@
         </w:tc>
         <w:tc>
           <w:tcPr>
-            <w:tcW w:type="dxa" w:w="1584"/>
+            <w:tcW w:type="dxa" w:w="1634"/>
           </w:tcPr>
           <w:p>
+            <w:pPr>
+              <w:spacing w:after="40" w:before="40" w:line="240" w:lineRule="auto"/>
+            </w:pPr>
             <w:r/>
             <w:r>
               <w:rPr>
@@ -1580,9 +1903,12 @@
         </w:tc>
         <w:tc>
           <w:tcPr>
-            <w:tcW w:type="dxa" w:w="576"/>
+            <w:tcW w:type="dxa" w:w="594"/>
           </w:tcPr>
           <w:p>
+            <w:pPr>
+              <w:spacing w:after="40" w:before="40" w:line="240" w:lineRule="auto"/>
+            </w:pPr>
             <w:r/>
             <w:r>
               <w:rPr>
@@ -1595,9 +1921,12 @@
         </w:tc>
         <w:tc>
           <w:tcPr>
-            <w:tcW w:type="dxa" w:w="864"/>
+            <w:tcW w:type="dxa" w:w="891"/>
           </w:tcPr>
           <w:p>
+            <w:pPr>
+              <w:spacing w:after="40" w:before="40" w:line="240" w:lineRule="auto"/>
+            </w:pPr>
             <w:r/>
             <w:r>
               <w:rPr>
@@ -1610,9 +1939,12 @@
         </w:tc>
         <w:tc>
           <w:tcPr>
-            <w:tcW w:type="dxa" w:w="1296"/>
+            <w:tcW w:type="dxa" w:w="1337"/>
           </w:tcPr>
           <w:p>
+            <w:pPr>
+              <w:spacing w:after="40" w:before="40" w:line="240" w:lineRule="auto"/>
+            </w:pPr>
             <w:r/>
             <w:r>
               <w:rPr>
@@ -1625,9 +1957,12 @@
         </w:tc>
         <w:tc>
           <w:tcPr>
-            <w:tcW w:type="dxa" w:w="1296"/>
+            <w:tcW w:type="dxa" w:w="1337"/>
           </w:tcPr>
           <w:p>
+            <w:pPr>
+              <w:spacing w:after="40" w:before="40" w:line="240" w:lineRule="auto"/>
+            </w:pPr>
             <w:r/>
             <w:r>
               <w:rPr>
@@ -1642,9 +1977,12 @@
       <w:tr>
         <w:tc>
           <w:tcPr>
-            <w:tcW w:type="dxa" w:w="2160"/>
+            <w:tcW w:type="dxa" w:w="2229"/>
           </w:tcPr>
           <w:p>
+            <w:pPr>
+              <w:spacing w:after="40" w:before="40" w:line="240" w:lineRule="auto"/>
+            </w:pPr>
             <w:r/>
             <w:r>
               <w:rPr>
@@ -1657,9 +1995,12 @@
         </w:tc>
         <w:tc>
           <w:tcPr>
-            <w:tcW w:type="dxa" w:w="1296"/>
+            <w:tcW w:type="dxa" w:w="1337"/>
           </w:tcPr>
           <w:p>
+            <w:pPr>
+              <w:spacing w:after="40" w:before="40" w:line="240" w:lineRule="auto"/>
+            </w:pPr>
             <w:r/>
             <w:r>
               <w:rPr>
@@ -1672,9 +2013,12 @@
         </w:tc>
         <w:tc>
           <w:tcPr>
-            <w:tcW w:type="dxa" w:w="1584"/>
+            <w:tcW w:type="dxa" w:w="1634"/>
           </w:tcPr>
           <w:p>
+            <w:pPr>
+              <w:spacing w:after="40" w:before="40" w:line="240" w:lineRule="auto"/>
+            </w:pPr>
             <w:r/>
             <w:r>
               <w:rPr>
@@ -1687,9 +2031,12 @@
         </w:tc>
         <w:tc>
           <w:tcPr>
-            <w:tcW w:type="dxa" w:w="576"/>
+            <w:tcW w:type="dxa" w:w="594"/>
           </w:tcPr>
           <w:p>
+            <w:pPr>
+              <w:spacing w:after="40" w:before="40" w:line="240" w:lineRule="auto"/>
+            </w:pPr>
             <w:r/>
             <w:r>
               <w:rPr>
@@ -1702,9 +2049,12 @@
         </w:tc>
         <w:tc>
           <w:tcPr>
-            <w:tcW w:type="dxa" w:w="864"/>
+            <w:tcW w:type="dxa" w:w="891"/>
           </w:tcPr>
           <w:p>
+            <w:pPr>
+              <w:spacing w:after="40" w:before="40" w:line="240" w:lineRule="auto"/>
+            </w:pPr>
             <w:r/>
             <w:r>
               <w:rPr>
@@ -1717,9 +2067,12 @@
         </w:tc>
         <w:tc>
           <w:tcPr>
-            <w:tcW w:type="dxa" w:w="1296"/>
+            <w:tcW w:type="dxa" w:w="1337"/>
           </w:tcPr>
           <w:p>
+            <w:pPr>
+              <w:spacing w:after="40" w:before="40" w:line="240" w:lineRule="auto"/>
+            </w:pPr>
             <w:r/>
             <w:r>
               <w:rPr>
@@ -1732,9 +2085,12 @@
         </w:tc>
         <w:tc>
           <w:tcPr>
-            <w:tcW w:type="dxa" w:w="1296"/>
+            <w:tcW w:type="dxa" w:w="1337"/>
           </w:tcPr>
           <w:p>
+            <w:pPr>
+              <w:spacing w:after="40" w:before="40" w:line="240" w:lineRule="auto"/>
+            </w:pPr>
             <w:r/>
             <w:r>
               <w:rPr>
@@ -1749,9 +2105,12 @@
       <w:tr>
         <w:tc>
           <w:tcPr>
-            <w:tcW w:type="dxa" w:w="2160"/>
+            <w:tcW w:type="dxa" w:w="2229"/>
           </w:tcPr>
           <w:p>
+            <w:pPr>
+              <w:spacing w:after="40" w:before="40" w:line="240" w:lineRule="auto"/>
+            </w:pPr>
             <w:r/>
             <w:r>
               <w:rPr>
@@ -1764,9 +2123,12 @@
         </w:tc>
         <w:tc>
           <w:tcPr>
-            <w:tcW w:type="dxa" w:w="1296"/>
+            <w:tcW w:type="dxa" w:w="1337"/>
           </w:tcPr>
           <w:p>
+            <w:pPr>
+              <w:spacing w:after="40" w:before="40" w:line="240" w:lineRule="auto"/>
+            </w:pPr>
             <w:r/>
             <w:r>
               <w:rPr>
@@ -1779,9 +2141,12 @@
         </w:tc>
         <w:tc>
           <w:tcPr>
-            <w:tcW w:type="dxa" w:w="1584"/>
+            <w:tcW w:type="dxa" w:w="1634"/>
           </w:tcPr>
           <w:p>
+            <w:pPr>
+              <w:spacing w:after="40" w:before="40" w:line="240" w:lineRule="auto"/>
+            </w:pPr>
             <w:r/>
             <w:r>
               <w:rPr>
@@ -1794,9 +2159,12 @@
         </w:tc>
         <w:tc>
           <w:tcPr>
-            <w:tcW w:type="dxa" w:w="576"/>
+            <w:tcW w:type="dxa" w:w="594"/>
           </w:tcPr>
           <w:p>
+            <w:pPr>
+              <w:spacing w:after="40" w:before="40" w:line="240" w:lineRule="auto"/>
+            </w:pPr>
             <w:r/>
             <w:r>
               <w:rPr>
@@ -1809,9 +2177,12 @@
         </w:tc>
         <w:tc>
           <w:tcPr>
-            <w:tcW w:type="dxa" w:w="864"/>
+            <w:tcW w:type="dxa" w:w="891"/>
           </w:tcPr>
           <w:p>
+            <w:pPr>
+              <w:spacing w:after="40" w:before="40" w:line="240" w:lineRule="auto"/>
+            </w:pPr>
             <w:r/>
             <w:r>
               <w:rPr>
@@ -1824,9 +2195,12 @@
         </w:tc>
         <w:tc>
           <w:tcPr>
-            <w:tcW w:type="dxa" w:w="1296"/>
+            <w:tcW w:type="dxa" w:w="1337"/>
           </w:tcPr>
           <w:p>
+            <w:pPr>
+              <w:spacing w:after="40" w:before="40" w:line="240" w:lineRule="auto"/>
+            </w:pPr>
             <w:r/>
             <w:r>
               <w:rPr>
@@ -1839,9 +2213,12 @@
         </w:tc>
         <w:tc>
           <w:tcPr>
-            <w:tcW w:type="dxa" w:w="1296"/>
+            <w:tcW w:type="dxa" w:w="1337"/>
           </w:tcPr>
           <w:p>
+            <w:pPr>
+              <w:spacing w:after="40" w:before="40" w:line="240" w:lineRule="auto"/>
+            </w:pPr>
             <w:r/>
             <w:r>
               <w:rPr>
@@ -1856,9 +2233,12 @@
       <w:tr>
         <w:tc>
           <w:tcPr>
-            <w:tcW w:type="dxa" w:w="2160"/>
+            <w:tcW w:type="dxa" w:w="2229"/>
           </w:tcPr>
           <w:p>
+            <w:pPr>
+              <w:spacing w:after="40" w:before="40" w:line="240" w:lineRule="auto"/>
+            </w:pPr>
             <w:r/>
             <w:r>
               <w:rPr>
@@ -1871,9 +2251,12 @@
         </w:tc>
         <w:tc>
           <w:tcPr>
-            <w:tcW w:type="dxa" w:w="1296"/>
+            <w:tcW w:type="dxa" w:w="1337"/>
           </w:tcPr>
           <w:p>
+            <w:pPr>
+              <w:spacing w:after="40" w:before="40" w:line="240" w:lineRule="auto"/>
+            </w:pPr>
             <w:r/>
             <w:r>
               <w:rPr>
@@ -1886,9 +2269,12 @@
         </w:tc>
         <w:tc>
           <w:tcPr>
-            <w:tcW w:type="dxa" w:w="1584"/>
+            <w:tcW w:type="dxa" w:w="1634"/>
           </w:tcPr>
           <w:p>
+            <w:pPr>
+              <w:spacing w:after="40" w:before="40" w:line="240" w:lineRule="auto"/>
+            </w:pPr>
             <w:r/>
             <w:r>
               <w:rPr>
@@ -1901,9 +2287,12 @@
         </w:tc>
         <w:tc>
           <w:tcPr>
-            <w:tcW w:type="dxa" w:w="576"/>
+            <w:tcW w:type="dxa" w:w="594"/>
           </w:tcPr>
           <w:p>
+            <w:pPr>
+              <w:spacing w:after="40" w:before="40" w:line="240" w:lineRule="auto"/>
+            </w:pPr>
             <w:r/>
             <w:r>
               <w:rPr>
@@ -1916,9 +2305,12 @@
         </w:tc>
         <w:tc>
           <w:tcPr>
-            <w:tcW w:type="dxa" w:w="864"/>
+            <w:tcW w:type="dxa" w:w="891"/>
           </w:tcPr>
           <w:p>
+            <w:pPr>
+              <w:spacing w:after="40" w:before="40" w:line="240" w:lineRule="auto"/>
+            </w:pPr>
             <w:r/>
             <w:r>
               <w:rPr>
@@ -1931,9 +2323,12 @@
         </w:tc>
         <w:tc>
           <w:tcPr>
-            <w:tcW w:type="dxa" w:w="1296"/>
+            <w:tcW w:type="dxa" w:w="1337"/>
           </w:tcPr>
           <w:p>
+            <w:pPr>
+              <w:spacing w:after="40" w:before="40" w:line="240" w:lineRule="auto"/>
+            </w:pPr>
             <w:r/>
             <w:r>
               <w:rPr>
@@ -1946,9 +2341,12 @@
         </w:tc>
         <w:tc>
           <w:tcPr>
-            <w:tcW w:type="dxa" w:w="1296"/>
+            <w:tcW w:type="dxa" w:w="1337"/>
           </w:tcPr>
           <w:p>
+            <w:pPr>
+              <w:spacing w:after="40" w:before="40" w:line="240" w:lineRule="auto"/>
+            </w:pPr>
             <w:r/>
             <w:r>
               <w:rPr>
@@ -1962,12 +2360,15 @@
       </w:tr>
     </w:tbl>
     <w:p>
+      <w:pPr>
+        <w:spacing w:line="240" w:lineRule="auto"/>
+      </w:pPr>
       <w:r>
         <w:rPr>
           <w:i/>
           <w:sz w:val="18"/>
         </w:rPr>
-        <w:t>Discrimination of the frozen scoring rule. The locked validation rows are the analysis population; the external row is a fully held-out seed that was never used to fit or to tune the rule. Discrimination is modest, which is why strata are reported as predicted-baseline-success bands rather than as a validated controllability construct.</w:t>
+        <w:t>Retrospective discrimination: the score uses realised baseline average intensity and is not available before treatment. The external seed was not used to fit the rule. Held-out overall Brier score is 0.265. Recomputed band calibration is supplied in band_calibration.csv. No prospective predictive validity is claimed.</w:t>
       </w:r>
     </w:p>
     <w:sectPr>

</xml_diff>

<commit_message>
Audit references and model provenance for manuscript v1.1.1
</commit_message>
<xml_diff>
--- a/peerj_analysis/tables/Supplemental Table S1.docx
+++ b/peerj_analysis/tables/Supplemental Table S1.docx
@@ -197,7 +197,7 @@
                 <w:rFonts w:ascii="Times New Roman" w:hAnsi="Times New Roman"/>
                 <w:sz w:val="16"/>
               </w:rPr>
-              <w:t>locked validation (seeds 20260720-22)</w:t>
+              <w:t>validation (seeds 20260720-22)</w:t>
             </w:r>
           </w:p>
         </w:tc>
@@ -325,7 +325,7 @@
                 <w:rFonts w:ascii="Times New Roman" w:hAnsi="Times New Roman"/>
                 <w:sz w:val="16"/>
               </w:rPr>
-              <w:t>locked validation (seeds 20260720-22)</w:t>
+              <w:t>validation (seeds 20260720-22)</w:t>
             </w:r>
           </w:p>
         </w:tc>
@@ -453,7 +453,7 @@
                 <w:rFonts w:ascii="Times New Roman" w:hAnsi="Times New Roman"/>
                 <w:sz w:val="16"/>
               </w:rPr>
-              <w:t>locked validation (seeds 20260720-22)</w:t>
+              <w:t>validation (seeds 20260720-22)</w:t>
             </w:r>
           </w:p>
         </w:tc>
@@ -581,7 +581,7 @@
                 <w:rFonts w:ascii="Times New Roman" w:hAnsi="Times New Roman"/>
                 <w:sz w:val="16"/>
               </w:rPr>
-              <w:t>locked validation (seeds 20260720-22)</w:t>
+              <w:t>validation (seeds 20260720-22)</w:t>
             </w:r>
           </w:p>
         </w:tc>
@@ -709,7 +709,7 @@
                 <w:rFonts w:ascii="Times New Roman" w:hAnsi="Times New Roman"/>
                 <w:sz w:val="16"/>
               </w:rPr>
-              <w:t>locked validation (seeds 20260720-22)</w:t>
+              <w:t>validation (seeds 20260720-22)</w:t>
             </w:r>
           </w:p>
         </w:tc>
@@ -837,7 +837,7 @@
                 <w:rFonts w:ascii="Times New Roman" w:hAnsi="Times New Roman"/>
                 <w:sz w:val="16"/>
               </w:rPr>
-              <w:t>locked validation (seeds 20260720-22)</w:t>
+              <w:t>validation (seeds 20260720-22)</w:t>
             </w:r>
           </w:p>
         </w:tc>
@@ -965,7 +965,7 @@
                 <w:rFonts w:ascii="Times New Roman" w:hAnsi="Times New Roman"/>
                 <w:sz w:val="16"/>
               </w:rPr>
-              <w:t>locked validation (seeds 20260720-22)</w:t>
+              <w:t>validation (seeds 20260720-22)</w:t>
             </w:r>
           </w:p>
         </w:tc>
@@ -1093,7 +1093,7 @@
                 <w:rFonts w:ascii="Times New Roman" w:hAnsi="Times New Roman"/>
                 <w:sz w:val="16"/>
               </w:rPr>
-              <w:t>locked validation (seeds 20260720-22)</w:t>
+              <w:t>validation (seeds 20260720-22)</w:t>
             </w:r>
           </w:p>
         </w:tc>
@@ -1221,7 +1221,7 @@
                 <w:rFonts w:ascii="Times New Roman" w:hAnsi="Times New Roman"/>
                 <w:sz w:val="16"/>
               </w:rPr>
-              <w:t>locked validation (seeds 20260720-22)</w:t>
+              <w:t>validation (seeds 20260720-22)</w:t>
             </w:r>
           </w:p>
         </w:tc>
@@ -1349,7 +1349,7 @@
                 <w:rFonts w:ascii="Times New Roman" w:hAnsi="Times New Roman"/>
                 <w:sz w:val="16"/>
               </w:rPr>
-              <w:t>locked validation (seeds 20260720-22)</w:t>
+              <w:t>validation (seeds 20260720-22)</w:t>
             </w:r>
           </w:p>
         </w:tc>
@@ -1477,7 +1477,7 @@
                 <w:rFonts w:ascii="Times New Roman" w:hAnsi="Times New Roman"/>
                 <w:sz w:val="16"/>
               </w:rPr>
-              <w:t>locked validation (seeds 20260720-22)</w:t>
+              <w:t>validation (seeds 20260720-22)</w:t>
             </w:r>
           </w:p>
         </w:tc>
@@ -1605,7 +1605,7 @@
                 <w:rFonts w:ascii="Times New Roman" w:hAnsi="Times New Roman"/>
                 <w:sz w:val="16"/>
               </w:rPr>
-              <w:t>locked validation (seeds 20260720-22)</w:t>
+              <w:t>validation (seeds 20260720-22)</w:t>
             </w:r>
           </w:p>
         </w:tc>

</xml_diff>